<commit_message>
Expand and verify all exercise report sections
</commit_message>
<xml_diff>
--- a/public/report.docx
+++ b/public/report.docx
@@ -48,14 +48,21 @@
     <w:tbl>
       <w:tblPr>
         <w:tblStyle w:val="TableGrid"/>
-        <w:tblW w:type="auto" w:w="0"/>
-        <w:jc w:val="center"/>
+        <w:tblW w:type="dxa" w:w="9360"/>
+        <w:jc w:val="left"/>
         <w:tblLayout w:type="fixed"/>
         <w:tblLook w:firstColumn="1" w:firstRow="1" w:lastColumn="0" w:lastRow="0" w:noHBand="0" w:noVBand="1" w:val="04A0"/>
+        <w:tblInd w:w="120" w:type="dxa"/>
+        <w:tblCellMar>
+          <w:top w:w="80" w:type="dxa"/>
+          <w:bottom w:w="80" w:type="dxa"/>
+          <w:start w:w="120" w:type="dxa"/>
+          <w:end w:w="120" w:type="dxa"/>
+        </w:tblCellMar>
       </w:tblPr>
       <w:tblGrid>
-        <w:gridCol w:w="4680"/>
-        <w:gridCol w:w="4680"/>
+        <w:gridCol w:w="2232"/>
+        <w:gridCol w:w="7128"/>
       </w:tblGrid>
       <w:tr>
         <w:trPr>
@@ -363,7 +370,7 @@
     </w:p>
     <w:p>
       <w:pPr>
-        <w:pStyle w:val="Heading2"/>
+        <w:pStyle w:val="Heading1"/>
       </w:pPr>
       <w:r>
         <w:t>Abstract</w:t>
@@ -374,7 +381,7 @@
         <w:widowControl/>
       </w:pPr>
       <w:r>
-        <w:t>This project analyzes 7,050 anonymized Facebook posts and completes seven reproducible network-visualization exercises. It combines cleaning, feature engineering, static and interactive visualization, graph statistics, testing, and public web delivery. Video posts have the largest observed mean total engagement (1,041.57), but the observational design does not establish causality.</w:t>
+        <w:t>An analysis is presented of 7,050 anonymized Facebook posts, and seven reproducible network-visualization exercises are completed. Cleaning, feature engineering, static and interactive visualization, graph statistics, testing, and public web delivery are combined. The largest observed mean total engagement is associated with video posts (1,041.57), but causality is not established by the observational design.</w:t>
       </w:r>
     </w:p>
     <w:p>
@@ -398,7 +405,7 @@
         <w:widowControl/>
       </w:pPr>
       <w:r>
-        <w:t>The study describes multidimensional engagement while preserving the distinction between real tabular observations and synthetic relationship graphs. It asks how engagement varies by content and time, how visual layout changes structural readability, and which canonical graph models capture specific social-network properties.</w:t>
+        <w:t>Multidimensional engagement is described while the distinction between real tabular observations and synthetic relationship graphs is preserved. Variation by content and time, structural readability under different visual layouts, and the social-network properties captured by canonical graph models are examined.</w:t>
       </w:r>
     </w:p>
     <w:p>
@@ -488,18 +495,25 @@
     <w:tbl>
       <w:tblPr>
         <w:tblStyle w:val="TableGrid"/>
-        <w:tblW w:type="auto" w:w="0"/>
-        <w:jc w:val="center"/>
+        <w:tblW w:type="dxa" w:w="9360"/>
+        <w:jc w:val="left"/>
         <w:tblLayout w:type="fixed"/>
         <w:tblLook w:firstColumn="1" w:firstRow="1" w:lastColumn="0" w:lastRow="0" w:noHBand="0" w:noVBand="1" w:val="04A0"/>
+        <w:tblInd w:w="120" w:type="dxa"/>
+        <w:tblCellMar>
+          <w:top w:w="80" w:type="dxa"/>
+          <w:bottom w:w="80" w:type="dxa"/>
+          <w:start w:w="120" w:type="dxa"/>
+          <w:end w:w="120" w:type="dxa"/>
+        </w:tblCellMar>
       </w:tblPr>
       <w:tblGrid>
-        <w:gridCol w:w="1560"/>
-        <w:gridCol w:w="1560"/>
-        <w:gridCol w:w="1560"/>
-        <w:gridCol w:w="1560"/>
-        <w:gridCol w:w="1560"/>
-        <w:gridCol w:w="1560"/>
+        <w:gridCol w:w="1008"/>
+        <w:gridCol w:w="936"/>
+        <w:gridCol w:w="1656"/>
+        <w:gridCol w:w="1656"/>
+        <w:gridCol w:w="1512"/>
+        <w:gridCol w:w="2592"/>
       </w:tblGrid>
       <w:tr>
         <w:trPr>
@@ -507,7 +521,7 @@
         </w:trPr>
         <w:tc>
           <w:tcPr>
-            <w:tcW w:type="dxa" w:w="1080"/>
+            <w:tcW w:type="dxa" w:w="1008"/>
             <w:shd w:fill="E9EEF3"/>
             <w:vAlign w:val="center"/>
           </w:tcPr>
@@ -539,7 +553,7 @@
         </w:tc>
         <w:tc>
           <w:tcPr>
-            <w:tcW w:type="dxa" w:w="1584"/>
+            <w:tcW w:type="dxa" w:w="1656"/>
             <w:shd w:fill="E9EEF3"/>
             <w:vAlign w:val="center"/>
           </w:tcPr>
@@ -555,7 +569,7 @@
         </w:tc>
         <w:tc>
           <w:tcPr>
-            <w:tcW w:type="dxa" w:w="1512"/>
+            <w:tcW w:type="dxa" w:w="1656"/>
             <w:shd w:fill="E9EEF3"/>
             <w:vAlign w:val="center"/>
           </w:tcPr>
@@ -571,7 +585,7 @@
         </w:tc>
         <w:tc>
           <w:tcPr>
-            <w:tcW w:type="dxa" w:w="1368"/>
+            <w:tcW w:type="dxa" w:w="1512"/>
             <w:shd w:fill="E9EEF3"/>
             <w:vAlign w:val="center"/>
           </w:tcPr>
@@ -587,7 +601,7 @@
         </w:tc>
         <w:tc>
           <w:tcPr>
-            <w:tcW w:type="dxa" w:w="1728"/>
+            <w:tcW w:type="dxa" w:w="2592"/>
             <w:shd w:fill="E9EEF3"/>
             <w:vAlign w:val="center"/>
           </w:tcPr>
@@ -605,7 +619,7 @@
       <w:tr>
         <w:tc>
           <w:tcPr>
-            <w:tcW w:type="dxa" w:w="1080"/>
+            <w:tcW w:type="dxa" w:w="1008"/>
             <w:vAlign w:val="center"/>
           </w:tcPr>
           <w:p>
@@ -639,7 +653,7 @@
         </w:tc>
         <w:tc>
           <w:tcPr>
-            <w:tcW w:type="dxa" w:w="1584"/>
+            <w:tcW w:type="dxa" w:w="1656"/>
             <w:vAlign w:val="center"/>
           </w:tcPr>
           <w:p>
@@ -656,7 +670,7 @@
         </w:tc>
         <w:tc>
           <w:tcPr>
-            <w:tcW w:type="dxa" w:w="1512"/>
+            <w:tcW w:type="dxa" w:w="1656"/>
             <w:vAlign w:val="center"/>
           </w:tcPr>
           <w:p>
@@ -673,7 +687,7 @@
         </w:tc>
         <w:tc>
           <w:tcPr>
-            <w:tcW w:type="dxa" w:w="1368"/>
+            <w:tcW w:type="dxa" w:w="1512"/>
             <w:vAlign w:val="center"/>
           </w:tcPr>
           <w:p>
@@ -690,7 +704,7 @@
         </w:tc>
         <w:tc>
           <w:tcPr>
-            <w:tcW w:type="dxa" w:w="1728"/>
+            <w:tcW w:type="dxa" w:w="2592"/>
             <w:vAlign w:val="center"/>
           </w:tcPr>
           <w:p>
@@ -709,7 +723,7 @@
       <w:tr>
         <w:tc>
           <w:tcPr>
-            <w:tcW w:type="dxa" w:w="1080"/>
+            <w:tcW w:type="dxa" w:w="1008"/>
             <w:vAlign w:val="center"/>
           </w:tcPr>
           <w:p>
@@ -743,7 +757,7 @@
         </w:tc>
         <w:tc>
           <w:tcPr>
-            <w:tcW w:type="dxa" w:w="1584"/>
+            <w:tcW w:type="dxa" w:w="1656"/>
             <w:vAlign w:val="center"/>
           </w:tcPr>
           <w:p>
@@ -760,7 +774,7 @@
         </w:tc>
         <w:tc>
           <w:tcPr>
-            <w:tcW w:type="dxa" w:w="1512"/>
+            <w:tcW w:type="dxa" w:w="1656"/>
             <w:vAlign w:val="center"/>
           </w:tcPr>
           <w:p>
@@ -777,7 +791,7 @@
         </w:tc>
         <w:tc>
           <w:tcPr>
-            <w:tcW w:type="dxa" w:w="1368"/>
+            <w:tcW w:type="dxa" w:w="1512"/>
             <w:vAlign w:val="center"/>
           </w:tcPr>
           <w:p>
@@ -794,7 +808,7 @@
         </w:tc>
         <w:tc>
           <w:tcPr>
-            <w:tcW w:type="dxa" w:w="1728"/>
+            <w:tcW w:type="dxa" w:w="2592"/>
             <w:vAlign w:val="center"/>
           </w:tcPr>
           <w:p>
@@ -813,7 +827,7 @@
       <w:tr>
         <w:tc>
           <w:tcPr>
-            <w:tcW w:type="dxa" w:w="1080"/>
+            <w:tcW w:type="dxa" w:w="1008"/>
             <w:vAlign w:val="center"/>
           </w:tcPr>
           <w:p>
@@ -847,7 +861,7 @@
         </w:tc>
         <w:tc>
           <w:tcPr>
-            <w:tcW w:type="dxa" w:w="1584"/>
+            <w:tcW w:type="dxa" w:w="1656"/>
             <w:vAlign w:val="center"/>
           </w:tcPr>
           <w:p>
@@ -864,7 +878,7 @@
         </w:tc>
         <w:tc>
           <w:tcPr>
-            <w:tcW w:type="dxa" w:w="1512"/>
+            <w:tcW w:type="dxa" w:w="1656"/>
             <w:vAlign w:val="center"/>
           </w:tcPr>
           <w:p>
@@ -881,7 +895,7 @@
         </w:tc>
         <w:tc>
           <w:tcPr>
-            <w:tcW w:type="dxa" w:w="1368"/>
+            <w:tcW w:type="dxa" w:w="1512"/>
             <w:vAlign w:val="center"/>
           </w:tcPr>
           <w:p>
@@ -898,7 +912,7 @@
         </w:tc>
         <w:tc>
           <w:tcPr>
-            <w:tcW w:type="dxa" w:w="1728"/>
+            <w:tcW w:type="dxa" w:w="2592"/>
             <w:vAlign w:val="center"/>
           </w:tcPr>
           <w:p>
@@ -917,7 +931,7 @@
       <w:tr>
         <w:tc>
           <w:tcPr>
-            <w:tcW w:type="dxa" w:w="1080"/>
+            <w:tcW w:type="dxa" w:w="1008"/>
             <w:vAlign w:val="center"/>
           </w:tcPr>
           <w:p>
@@ -951,7 +965,7 @@
         </w:tc>
         <w:tc>
           <w:tcPr>
-            <w:tcW w:type="dxa" w:w="1584"/>
+            <w:tcW w:type="dxa" w:w="1656"/>
             <w:vAlign w:val="center"/>
           </w:tcPr>
           <w:p>
@@ -968,7 +982,7 @@
         </w:tc>
         <w:tc>
           <w:tcPr>
-            <w:tcW w:type="dxa" w:w="1512"/>
+            <w:tcW w:type="dxa" w:w="1656"/>
             <w:vAlign w:val="center"/>
           </w:tcPr>
           <w:p>
@@ -985,7 +999,7 @@
         </w:tc>
         <w:tc>
           <w:tcPr>
-            <w:tcW w:type="dxa" w:w="1368"/>
+            <w:tcW w:type="dxa" w:w="1512"/>
             <w:vAlign w:val="center"/>
           </w:tcPr>
           <w:p>
@@ -1002,7 +1016,7 @@
         </w:tc>
         <w:tc>
           <w:tcPr>
-            <w:tcW w:type="dxa" w:w="1728"/>
+            <w:tcW w:type="dxa" w:w="2592"/>
             <w:vAlign w:val="center"/>
           </w:tcPr>
           <w:p>
@@ -1151,6 +1165,75 @@
     </w:p>
     <w:p>
       <w:pPr>
+        <w:pStyle w:val="Heading2"/>
+      </w:pPr>
+      <w:r>
+        <w:t>5.1 Rank-correlation result</w:t>
+      </w:r>
+    </w:p>
+    <w:p>
+      <w:pPr>
+        <w:widowControl/>
+      </w:pPr>
+      <w:r>
+        <w:t>Spearman rank correlation was used because the engagement variables are strongly skewed. The coefficients describe monotonic association and were not interpreted as causal effects.</w:t>
+      </w:r>
+    </w:p>
+    <w:p>
+      <w:pPr>
+        <w:jc w:val="center"/>
+      </w:pPr>
+      <w:r>
+        <w:drawing>
+          <wp:inline xmlns:a="http://schemas.openxmlformats.org/drawingml/2006/main" xmlns:pic="http://schemas.openxmlformats.org/drawingml/2006/picture">
+            <wp:extent cx="5623560" cy="4040752"/>
+            <wp:docPr id="3" name="Picture 3" descr="Heatmap of rank correlations among reactions, comments, shares, and total engagement."/>
+            <wp:cNvGraphicFramePr>
+              <a:graphicFrameLocks noChangeAspect="1"/>
+            </wp:cNvGraphicFramePr>
+            <a:graphic>
+              <a:graphicData uri="http://schemas.openxmlformats.org/drawingml/2006/picture">
+                <pic:pic>
+                  <pic:nvPicPr>
+                    <pic:cNvPr id="0" name="engagement_correlation.png"/>
+                    <pic:cNvPicPr/>
+                  </pic:nvPicPr>
+                  <pic:blipFill>
+                    <a:blip r:embed="rId13"/>
+                    <a:stretch>
+                      <a:fillRect/>
+                    </a:stretch>
+                  </pic:blipFill>
+                  <pic:spPr>
+                    <a:xfrm>
+                      <a:off x="0" y="0"/>
+                      <a:ext cx="5623560" cy="4040752"/>
+                    </a:xfrm>
+                    <a:prstGeom prst="rect"/>
+                  </pic:spPr>
+                </pic:pic>
+              </a:graphicData>
+            </a:graphic>
+          </wp:inline>
+        </w:drawing>
+      </w:r>
+    </w:p>
+    <w:p>
+      <w:pPr>
+        <w:pStyle w:val="Caption"/>
+        <w:keepNext w:val="0"/>
+        <w:jc w:val="center"/>
+      </w:pPr>
+      <w:r>
+        <w:rPr>
+          <w:i/>
+          <w:sz w:val="18"/>
+        </w:rPr>
+        <w:t>Figure 3. Spearman correlation matrix for engagement measures.</w:t>
+      </w:r>
+    </w:p>
+    <w:p>
+      <w:pPr>
         <w:pStyle w:val="Heading1"/>
       </w:pPr>
       <w:r>
@@ -1186,7 +1269,1208 @@
         <w:widowControl/>
       </w:pPr>
       <w:r>
-        <w:t>The G_transport matrix stores route distances in kilometers and is symmetric: True. Symmetry follows from undirected equal-weight edges; a directed or directionally weighted network could be asymmetric.</w:t>
+        <w:t>The relationship between an adjacency list and a weighted adjacency matrix was examined through the supplied G_transport network. Matrix symmetry and its implication for route direction were evaluated.</w:t>
+      </w:r>
+    </w:p>
+    <w:p>
+      <w:pPr>
+        <w:pStyle w:val="Heading2"/>
+      </w:pPr>
+      <w:r>
+        <w:t>7.1 Objective, construction, and procedure</w:t>
+      </w:r>
+    </w:p>
+    <w:p>
+      <w:pPr>
+        <w:widowControl/>
+      </w:pPr>
+      <w:r>
+        <w:t>Seven cities and 9 undirected teaching routes were represented. Distance in kilometers was stored in every edge weight. Density was 0.4286, and Dhaka received the largest degree (6).</w:t>
+      </w:r>
+    </w:p>
+    <w:p>
+      <w:pPr>
+        <w:widowControl/>
+      </w:pPr>
+      <w:r>
+        <w:t>A labeled adjacency list was produced from neighbor iterators. A weighted matrix was generated with nx.to_pandas_adjacency, and symmetry was tested by comparison with the transpose through numpy.allclose. Off-diagonal zeros were treated as absent routes.</w:t>
+      </w:r>
+    </w:p>
+    <w:p>
+      <w:pPr>
+        <w:pStyle w:val="Heading2"/>
+      </w:pPr>
+      <w:r>
+        <w:t>7.2 Verified results</w:t>
+      </w:r>
+    </w:p>
+    <w:p>
+      <w:pPr>
+        <w:widowControl/>
+      </w:pPr>
+      <w:r>
+        <w:t>The symmetry test returned True. The Chattogram-Sylhet edge was longest at 350 km, while the Khulna-Barishal edge was shortest at 130 km. Unique edge distances totaled 2,056 km.</w:t>
+      </w:r>
+    </w:p>
+    <w:p>
+      <w:pPr>
+        <w:spacing w:before="80" w:after="80"/>
+      </w:pPr>
+      <w:r>
+        <w:rPr>
+          <w:b/>
+          <w:sz w:val="19"/>
+        </w:rPr>
+        <w:t>Table 2. Weighted adjacency matrix (kilometers)</w:t>
+      </w:r>
+    </w:p>
+    <w:tbl>
+      <w:tblPr>
+        <w:tblStyle w:val="TableGrid"/>
+        <w:tblW w:type="dxa" w:w="9360"/>
+        <w:jc w:val="left"/>
+        <w:tblLayout w:type="fixed"/>
+        <w:tblLook w:firstColumn="1" w:firstRow="1" w:lastColumn="0" w:lastRow="0" w:noHBand="0" w:noVBand="1" w:val="04A0"/>
+        <w:tblInd w:w="120" w:type="dxa"/>
+        <w:tblCellMar>
+          <w:top w:w="80" w:type="dxa"/>
+          <w:bottom w:w="80" w:type="dxa"/>
+          <w:start w:w="120" w:type="dxa"/>
+          <w:end w:w="120" w:type="dxa"/>
+        </w:tblCellMar>
+      </w:tblPr>
+      <w:tblGrid>
+        <w:gridCol w:w="1440"/>
+        <w:gridCol w:w="1131"/>
+        <w:gridCol w:w="1131"/>
+        <w:gridCol w:w="1131"/>
+        <w:gridCol w:w="1131"/>
+        <w:gridCol w:w="1131"/>
+        <w:gridCol w:w="1131"/>
+        <w:gridCol w:w="1134"/>
+      </w:tblGrid>
+      <w:tr>
+        <w:trPr>
+          <w:tblHeader w:val="true"/>
+        </w:trPr>
+        <w:tc>
+          <w:tcPr>
+            <w:tcW w:type="dxa" w:w="1440"/>
+            <w:shd w:fill="E9EEF3"/>
+            <w:vAlign w:val="center"/>
+          </w:tcPr>
+          <w:p>
+            <w:r>
+              <w:rPr>
+                <w:b/>
+                <w:sz w:val="17"/>
+              </w:rPr>
+              <w:t>City</w:t>
+            </w:r>
+          </w:p>
+        </w:tc>
+        <w:tc>
+          <w:tcPr>
+            <w:tcW w:type="dxa" w:w="1131"/>
+            <w:shd w:fill="E9EEF3"/>
+            <w:vAlign w:val="center"/>
+          </w:tcPr>
+          <w:p>
+            <w:r>
+              <w:rPr>
+                <w:b/>
+                <w:sz w:val="17"/>
+              </w:rPr>
+              <w:t>Dhaka</w:t>
+            </w:r>
+          </w:p>
+        </w:tc>
+        <w:tc>
+          <w:tcPr>
+            <w:tcW w:type="dxa" w:w="1131"/>
+            <w:shd w:fill="E9EEF3"/>
+            <w:vAlign w:val="center"/>
+          </w:tcPr>
+          <w:p>
+            <w:r>
+              <w:rPr>
+                <w:b/>
+                <w:sz w:val="17"/>
+              </w:rPr>
+              <w:t>Chattogram</w:t>
+            </w:r>
+          </w:p>
+        </w:tc>
+        <w:tc>
+          <w:tcPr>
+            <w:tcW w:type="dxa" w:w="1131"/>
+            <w:shd w:fill="E9EEF3"/>
+            <w:vAlign w:val="center"/>
+          </w:tcPr>
+          <w:p>
+            <w:r>
+              <w:rPr>
+                <w:b/>
+                <w:sz w:val="17"/>
+              </w:rPr>
+              <w:t>Sylhet</w:t>
+            </w:r>
+          </w:p>
+        </w:tc>
+        <w:tc>
+          <w:tcPr>
+            <w:tcW w:type="dxa" w:w="1131"/>
+            <w:shd w:fill="E9EEF3"/>
+            <w:vAlign w:val="center"/>
+          </w:tcPr>
+          <w:p>
+            <w:r>
+              <w:rPr>
+                <w:b/>
+                <w:sz w:val="17"/>
+              </w:rPr>
+              <w:t>Khulna</w:t>
+            </w:r>
+          </w:p>
+        </w:tc>
+        <w:tc>
+          <w:tcPr>
+            <w:tcW w:type="dxa" w:w="1131"/>
+            <w:shd w:fill="E9EEF3"/>
+            <w:vAlign w:val="center"/>
+          </w:tcPr>
+          <w:p>
+            <w:r>
+              <w:rPr>
+                <w:b/>
+                <w:sz w:val="17"/>
+              </w:rPr>
+              <w:t>Rajshahi</w:t>
+            </w:r>
+          </w:p>
+        </w:tc>
+        <w:tc>
+          <w:tcPr>
+            <w:tcW w:type="dxa" w:w="1131"/>
+            <w:shd w:fill="E9EEF3"/>
+            <w:vAlign w:val="center"/>
+          </w:tcPr>
+          <w:p>
+            <w:r>
+              <w:rPr>
+                <w:b/>
+                <w:sz w:val="17"/>
+              </w:rPr>
+              <w:t>Barishal</w:t>
+            </w:r>
+          </w:p>
+        </w:tc>
+        <w:tc>
+          <w:tcPr>
+            <w:tcW w:type="dxa" w:w="1134"/>
+            <w:shd w:fill="E9EEF3"/>
+            <w:vAlign w:val="center"/>
+          </w:tcPr>
+          <w:p>
+            <w:r>
+              <w:rPr>
+                <w:b/>
+                <w:sz w:val="17"/>
+              </w:rPr>
+              <w:t>Rangpur</w:t>
+            </w:r>
+          </w:p>
+        </w:tc>
+      </w:tr>
+      <w:tr>
+        <w:tc>
+          <w:tcPr>
+            <w:tcW w:type="dxa" w:w="1440"/>
+            <w:vAlign w:val="center"/>
+          </w:tcPr>
+          <w:p>
+            <w:pPr>
+              <w:spacing w:after="0"/>
+            </w:pPr>
+            <w:r>
+              <w:rPr>
+                <w:sz w:val="16"/>
+              </w:rPr>
+              <w:t>Dhaka</w:t>
+            </w:r>
+          </w:p>
+        </w:tc>
+        <w:tc>
+          <w:tcPr>
+            <w:tcW w:type="dxa" w:w="1131"/>
+            <w:vAlign w:val="center"/>
+          </w:tcPr>
+          <w:p>
+            <w:pPr>
+              <w:spacing w:after="0"/>
+            </w:pPr>
+            <w:r>
+              <w:rPr>
+                <w:sz w:val="16"/>
+              </w:rPr>
+              <w:t>0</w:t>
+            </w:r>
+          </w:p>
+        </w:tc>
+        <w:tc>
+          <w:tcPr>
+            <w:tcW w:type="dxa" w:w="1131"/>
+            <w:vAlign w:val="center"/>
+          </w:tcPr>
+          <w:p>
+            <w:pPr>
+              <w:spacing w:after="0"/>
+            </w:pPr>
+            <w:r>
+              <w:rPr>
+                <w:sz w:val="16"/>
+              </w:rPr>
+              <w:t>264</w:t>
+            </w:r>
+          </w:p>
+        </w:tc>
+        <w:tc>
+          <w:tcPr>
+            <w:tcW w:type="dxa" w:w="1131"/>
+            <w:vAlign w:val="center"/>
+          </w:tcPr>
+          <w:p>
+            <w:pPr>
+              <w:spacing w:after="0"/>
+            </w:pPr>
+            <w:r>
+              <w:rPr>
+                <w:sz w:val="16"/>
+              </w:rPr>
+              <w:t>247</w:t>
+            </w:r>
+          </w:p>
+        </w:tc>
+        <w:tc>
+          <w:tcPr>
+            <w:tcW w:type="dxa" w:w="1131"/>
+            <w:vAlign w:val="center"/>
+          </w:tcPr>
+          <w:p>
+            <w:pPr>
+              <w:spacing w:after="0"/>
+            </w:pPr>
+            <w:r>
+              <w:rPr>
+                <w:sz w:val="16"/>
+              </w:rPr>
+              <w:t>209</w:t>
+            </w:r>
+          </w:p>
+        </w:tc>
+        <w:tc>
+          <w:tcPr>
+            <w:tcW w:type="dxa" w:w="1131"/>
+            <w:vAlign w:val="center"/>
+          </w:tcPr>
+          <w:p>
+            <w:pPr>
+              <w:spacing w:after="0"/>
+            </w:pPr>
+            <w:r>
+              <w:rPr>
+                <w:sz w:val="16"/>
+              </w:rPr>
+              <w:t>256</w:t>
+            </w:r>
+          </w:p>
+        </w:tc>
+        <w:tc>
+          <w:tcPr>
+            <w:tcW w:type="dxa" w:w="1131"/>
+            <w:vAlign w:val="center"/>
+          </w:tcPr>
+          <w:p>
+            <w:pPr>
+              <w:spacing w:after="0"/>
+            </w:pPr>
+            <w:r>
+              <w:rPr>
+                <w:sz w:val="16"/>
+              </w:rPr>
+              <w:t>170</w:t>
+            </w:r>
+          </w:p>
+        </w:tc>
+        <w:tc>
+          <w:tcPr>
+            <w:tcW w:type="dxa" w:w="1134"/>
+            <w:vAlign w:val="center"/>
+          </w:tcPr>
+          <w:p>
+            <w:pPr>
+              <w:spacing w:after="0"/>
+            </w:pPr>
+            <w:r>
+              <w:rPr>
+                <w:sz w:val="16"/>
+              </w:rPr>
+              <w:t>300</w:t>
+            </w:r>
+          </w:p>
+        </w:tc>
+      </w:tr>
+      <w:tr>
+        <w:tc>
+          <w:tcPr>
+            <w:tcW w:type="dxa" w:w="1440"/>
+            <w:vAlign w:val="center"/>
+          </w:tcPr>
+          <w:p>
+            <w:pPr>
+              <w:spacing w:after="0"/>
+            </w:pPr>
+            <w:r>
+              <w:rPr>
+                <w:sz w:val="16"/>
+              </w:rPr>
+              <w:t>Chattogram</w:t>
+            </w:r>
+          </w:p>
+        </w:tc>
+        <w:tc>
+          <w:tcPr>
+            <w:tcW w:type="dxa" w:w="1131"/>
+            <w:vAlign w:val="center"/>
+          </w:tcPr>
+          <w:p>
+            <w:pPr>
+              <w:spacing w:after="0"/>
+            </w:pPr>
+            <w:r>
+              <w:rPr>
+                <w:sz w:val="16"/>
+              </w:rPr>
+              <w:t>264</w:t>
+            </w:r>
+          </w:p>
+        </w:tc>
+        <w:tc>
+          <w:tcPr>
+            <w:tcW w:type="dxa" w:w="1131"/>
+            <w:vAlign w:val="center"/>
+          </w:tcPr>
+          <w:p>
+            <w:pPr>
+              <w:spacing w:after="0"/>
+            </w:pPr>
+            <w:r>
+              <w:rPr>
+                <w:sz w:val="16"/>
+              </w:rPr>
+              <w:t>0</w:t>
+            </w:r>
+          </w:p>
+        </w:tc>
+        <w:tc>
+          <w:tcPr>
+            <w:tcW w:type="dxa" w:w="1131"/>
+            <w:vAlign w:val="center"/>
+          </w:tcPr>
+          <w:p>
+            <w:pPr>
+              <w:spacing w:after="0"/>
+            </w:pPr>
+            <w:r>
+              <w:rPr>
+                <w:sz w:val="16"/>
+              </w:rPr>
+              <w:t>350</w:t>
+            </w:r>
+          </w:p>
+        </w:tc>
+        <w:tc>
+          <w:tcPr>
+            <w:tcW w:type="dxa" w:w="1131"/>
+            <w:vAlign w:val="center"/>
+          </w:tcPr>
+          <w:p>
+            <w:pPr>
+              <w:spacing w:after="0"/>
+            </w:pPr>
+            <w:r>
+              <w:rPr>
+                <w:sz w:val="16"/>
+              </w:rPr>
+              <w:t>0</w:t>
+            </w:r>
+          </w:p>
+        </w:tc>
+        <w:tc>
+          <w:tcPr>
+            <w:tcW w:type="dxa" w:w="1131"/>
+            <w:vAlign w:val="center"/>
+          </w:tcPr>
+          <w:p>
+            <w:pPr>
+              <w:spacing w:after="0"/>
+            </w:pPr>
+            <w:r>
+              <w:rPr>
+                <w:sz w:val="16"/>
+              </w:rPr>
+              <w:t>0</w:t>
+            </w:r>
+          </w:p>
+        </w:tc>
+        <w:tc>
+          <w:tcPr>
+            <w:tcW w:type="dxa" w:w="1131"/>
+            <w:vAlign w:val="center"/>
+          </w:tcPr>
+          <w:p>
+            <w:pPr>
+              <w:spacing w:after="0"/>
+            </w:pPr>
+            <w:r>
+              <w:rPr>
+                <w:sz w:val="16"/>
+              </w:rPr>
+              <w:t>0</w:t>
+            </w:r>
+          </w:p>
+        </w:tc>
+        <w:tc>
+          <w:tcPr>
+            <w:tcW w:type="dxa" w:w="1134"/>
+            <w:vAlign w:val="center"/>
+          </w:tcPr>
+          <w:p>
+            <w:pPr>
+              <w:spacing w:after="0"/>
+            </w:pPr>
+            <w:r>
+              <w:rPr>
+                <w:sz w:val="16"/>
+              </w:rPr>
+              <w:t>0</w:t>
+            </w:r>
+          </w:p>
+        </w:tc>
+      </w:tr>
+      <w:tr>
+        <w:tc>
+          <w:tcPr>
+            <w:tcW w:type="dxa" w:w="1440"/>
+            <w:vAlign w:val="center"/>
+          </w:tcPr>
+          <w:p>
+            <w:pPr>
+              <w:spacing w:after="0"/>
+            </w:pPr>
+            <w:r>
+              <w:rPr>
+                <w:sz w:val="16"/>
+              </w:rPr>
+              <w:t>Sylhet</w:t>
+            </w:r>
+          </w:p>
+        </w:tc>
+        <w:tc>
+          <w:tcPr>
+            <w:tcW w:type="dxa" w:w="1131"/>
+            <w:vAlign w:val="center"/>
+          </w:tcPr>
+          <w:p>
+            <w:pPr>
+              <w:spacing w:after="0"/>
+            </w:pPr>
+            <w:r>
+              <w:rPr>
+                <w:sz w:val="16"/>
+              </w:rPr>
+              <w:t>247</w:t>
+            </w:r>
+          </w:p>
+        </w:tc>
+        <w:tc>
+          <w:tcPr>
+            <w:tcW w:type="dxa" w:w="1131"/>
+            <w:vAlign w:val="center"/>
+          </w:tcPr>
+          <w:p>
+            <w:pPr>
+              <w:spacing w:after="0"/>
+            </w:pPr>
+            <w:r>
+              <w:rPr>
+                <w:sz w:val="16"/>
+              </w:rPr>
+              <w:t>350</w:t>
+            </w:r>
+          </w:p>
+        </w:tc>
+        <w:tc>
+          <w:tcPr>
+            <w:tcW w:type="dxa" w:w="1131"/>
+            <w:vAlign w:val="center"/>
+          </w:tcPr>
+          <w:p>
+            <w:pPr>
+              <w:spacing w:after="0"/>
+            </w:pPr>
+            <w:r>
+              <w:rPr>
+                <w:sz w:val="16"/>
+              </w:rPr>
+              <w:t>0</w:t>
+            </w:r>
+          </w:p>
+        </w:tc>
+        <w:tc>
+          <w:tcPr>
+            <w:tcW w:type="dxa" w:w="1131"/>
+            <w:vAlign w:val="center"/>
+          </w:tcPr>
+          <w:p>
+            <w:pPr>
+              <w:spacing w:after="0"/>
+            </w:pPr>
+            <w:r>
+              <w:rPr>
+                <w:sz w:val="16"/>
+              </w:rPr>
+              <w:t>0</w:t>
+            </w:r>
+          </w:p>
+        </w:tc>
+        <w:tc>
+          <w:tcPr>
+            <w:tcW w:type="dxa" w:w="1131"/>
+            <w:vAlign w:val="center"/>
+          </w:tcPr>
+          <w:p>
+            <w:pPr>
+              <w:spacing w:after="0"/>
+            </w:pPr>
+            <w:r>
+              <w:rPr>
+                <w:sz w:val="16"/>
+              </w:rPr>
+              <w:t>0</w:t>
+            </w:r>
+          </w:p>
+        </w:tc>
+        <w:tc>
+          <w:tcPr>
+            <w:tcW w:type="dxa" w:w="1131"/>
+            <w:vAlign w:val="center"/>
+          </w:tcPr>
+          <w:p>
+            <w:pPr>
+              <w:spacing w:after="0"/>
+            </w:pPr>
+            <w:r>
+              <w:rPr>
+                <w:sz w:val="16"/>
+              </w:rPr>
+              <w:t>0</w:t>
+            </w:r>
+          </w:p>
+        </w:tc>
+        <w:tc>
+          <w:tcPr>
+            <w:tcW w:type="dxa" w:w="1134"/>
+            <w:vAlign w:val="center"/>
+          </w:tcPr>
+          <w:p>
+            <w:pPr>
+              <w:spacing w:after="0"/>
+            </w:pPr>
+            <w:r>
+              <w:rPr>
+                <w:sz w:val="16"/>
+              </w:rPr>
+              <w:t>0</w:t>
+            </w:r>
+          </w:p>
+        </w:tc>
+      </w:tr>
+      <w:tr>
+        <w:tc>
+          <w:tcPr>
+            <w:tcW w:type="dxa" w:w="1440"/>
+            <w:vAlign w:val="center"/>
+          </w:tcPr>
+          <w:p>
+            <w:pPr>
+              <w:spacing w:after="0"/>
+            </w:pPr>
+            <w:r>
+              <w:rPr>
+                <w:sz w:val="16"/>
+              </w:rPr>
+              <w:t>Khulna</w:t>
+            </w:r>
+          </w:p>
+        </w:tc>
+        <w:tc>
+          <w:tcPr>
+            <w:tcW w:type="dxa" w:w="1131"/>
+            <w:vAlign w:val="center"/>
+          </w:tcPr>
+          <w:p>
+            <w:pPr>
+              <w:spacing w:after="0"/>
+            </w:pPr>
+            <w:r>
+              <w:rPr>
+                <w:sz w:val="16"/>
+              </w:rPr>
+              <w:t>209</w:t>
+            </w:r>
+          </w:p>
+        </w:tc>
+        <w:tc>
+          <w:tcPr>
+            <w:tcW w:type="dxa" w:w="1131"/>
+            <w:vAlign w:val="center"/>
+          </w:tcPr>
+          <w:p>
+            <w:pPr>
+              <w:spacing w:after="0"/>
+            </w:pPr>
+            <w:r>
+              <w:rPr>
+                <w:sz w:val="16"/>
+              </w:rPr>
+              <w:t>0</w:t>
+            </w:r>
+          </w:p>
+        </w:tc>
+        <w:tc>
+          <w:tcPr>
+            <w:tcW w:type="dxa" w:w="1131"/>
+            <w:vAlign w:val="center"/>
+          </w:tcPr>
+          <w:p>
+            <w:pPr>
+              <w:spacing w:after="0"/>
+            </w:pPr>
+            <w:r>
+              <w:rPr>
+                <w:sz w:val="16"/>
+              </w:rPr>
+              <w:t>0</w:t>
+            </w:r>
+          </w:p>
+        </w:tc>
+        <w:tc>
+          <w:tcPr>
+            <w:tcW w:type="dxa" w:w="1131"/>
+            <w:vAlign w:val="center"/>
+          </w:tcPr>
+          <w:p>
+            <w:pPr>
+              <w:spacing w:after="0"/>
+            </w:pPr>
+            <w:r>
+              <w:rPr>
+                <w:sz w:val="16"/>
+              </w:rPr>
+              <w:t>0</w:t>
+            </w:r>
+          </w:p>
+        </w:tc>
+        <w:tc>
+          <w:tcPr>
+            <w:tcW w:type="dxa" w:w="1131"/>
+            <w:vAlign w:val="center"/>
+          </w:tcPr>
+          <w:p>
+            <w:pPr>
+              <w:spacing w:after="0"/>
+            </w:pPr>
+            <w:r>
+              <w:rPr>
+                <w:sz w:val="16"/>
+              </w:rPr>
+              <w:t>0</w:t>
+            </w:r>
+          </w:p>
+        </w:tc>
+        <w:tc>
+          <w:tcPr>
+            <w:tcW w:type="dxa" w:w="1131"/>
+            <w:vAlign w:val="center"/>
+          </w:tcPr>
+          <w:p>
+            <w:pPr>
+              <w:spacing w:after="0"/>
+            </w:pPr>
+            <w:r>
+              <w:rPr>
+                <w:sz w:val="16"/>
+              </w:rPr>
+              <w:t>130</w:t>
+            </w:r>
+          </w:p>
+        </w:tc>
+        <w:tc>
+          <w:tcPr>
+            <w:tcW w:type="dxa" w:w="1134"/>
+            <w:vAlign w:val="center"/>
+          </w:tcPr>
+          <w:p>
+            <w:pPr>
+              <w:spacing w:after="0"/>
+            </w:pPr>
+            <w:r>
+              <w:rPr>
+                <w:sz w:val="16"/>
+              </w:rPr>
+              <w:t>0</w:t>
+            </w:r>
+          </w:p>
+        </w:tc>
+      </w:tr>
+      <w:tr>
+        <w:tc>
+          <w:tcPr>
+            <w:tcW w:type="dxa" w:w="1440"/>
+            <w:vAlign w:val="center"/>
+          </w:tcPr>
+          <w:p>
+            <w:pPr>
+              <w:spacing w:after="0"/>
+            </w:pPr>
+            <w:r>
+              <w:rPr>
+                <w:sz w:val="16"/>
+              </w:rPr>
+              <w:t>Rajshahi</w:t>
+            </w:r>
+          </w:p>
+        </w:tc>
+        <w:tc>
+          <w:tcPr>
+            <w:tcW w:type="dxa" w:w="1131"/>
+            <w:vAlign w:val="center"/>
+          </w:tcPr>
+          <w:p>
+            <w:pPr>
+              <w:spacing w:after="0"/>
+            </w:pPr>
+            <w:r>
+              <w:rPr>
+                <w:sz w:val="16"/>
+              </w:rPr>
+              <w:t>256</w:t>
+            </w:r>
+          </w:p>
+        </w:tc>
+        <w:tc>
+          <w:tcPr>
+            <w:tcW w:type="dxa" w:w="1131"/>
+            <w:vAlign w:val="center"/>
+          </w:tcPr>
+          <w:p>
+            <w:pPr>
+              <w:spacing w:after="0"/>
+            </w:pPr>
+            <w:r>
+              <w:rPr>
+                <w:sz w:val="16"/>
+              </w:rPr>
+              <w:t>0</w:t>
+            </w:r>
+          </w:p>
+        </w:tc>
+        <w:tc>
+          <w:tcPr>
+            <w:tcW w:type="dxa" w:w="1131"/>
+            <w:vAlign w:val="center"/>
+          </w:tcPr>
+          <w:p>
+            <w:pPr>
+              <w:spacing w:after="0"/>
+            </w:pPr>
+            <w:r>
+              <w:rPr>
+                <w:sz w:val="16"/>
+              </w:rPr>
+              <w:t>0</w:t>
+            </w:r>
+          </w:p>
+        </w:tc>
+        <w:tc>
+          <w:tcPr>
+            <w:tcW w:type="dxa" w:w="1131"/>
+            <w:vAlign w:val="center"/>
+          </w:tcPr>
+          <w:p>
+            <w:pPr>
+              <w:spacing w:after="0"/>
+            </w:pPr>
+            <w:r>
+              <w:rPr>
+                <w:sz w:val="16"/>
+              </w:rPr>
+              <w:t>0</w:t>
+            </w:r>
+          </w:p>
+        </w:tc>
+        <w:tc>
+          <w:tcPr>
+            <w:tcW w:type="dxa" w:w="1131"/>
+            <w:vAlign w:val="center"/>
+          </w:tcPr>
+          <w:p>
+            <w:pPr>
+              <w:spacing w:after="0"/>
+            </w:pPr>
+            <w:r>
+              <w:rPr>
+                <w:sz w:val="16"/>
+              </w:rPr>
+              <w:t>0</w:t>
+            </w:r>
+          </w:p>
+        </w:tc>
+        <w:tc>
+          <w:tcPr>
+            <w:tcW w:type="dxa" w:w="1131"/>
+            <w:vAlign w:val="center"/>
+          </w:tcPr>
+          <w:p>
+            <w:pPr>
+              <w:spacing w:after="0"/>
+            </w:pPr>
+            <w:r>
+              <w:rPr>
+                <w:sz w:val="16"/>
+              </w:rPr>
+              <w:t>0</w:t>
+            </w:r>
+          </w:p>
+        </w:tc>
+        <w:tc>
+          <w:tcPr>
+            <w:tcW w:type="dxa" w:w="1134"/>
+            <w:vAlign w:val="center"/>
+          </w:tcPr>
+          <w:p>
+            <w:pPr>
+              <w:spacing w:after="0"/>
+            </w:pPr>
+            <w:r>
+              <w:rPr>
+                <w:sz w:val="16"/>
+              </w:rPr>
+              <w:t>130</w:t>
+            </w:r>
+          </w:p>
+        </w:tc>
+      </w:tr>
+      <w:tr>
+        <w:tc>
+          <w:tcPr>
+            <w:tcW w:type="dxa" w:w="1440"/>
+            <w:vAlign w:val="center"/>
+          </w:tcPr>
+          <w:p>
+            <w:pPr>
+              <w:spacing w:after="0"/>
+            </w:pPr>
+            <w:r>
+              <w:rPr>
+                <w:sz w:val="16"/>
+              </w:rPr>
+              <w:t>Barishal</w:t>
+            </w:r>
+          </w:p>
+        </w:tc>
+        <w:tc>
+          <w:tcPr>
+            <w:tcW w:type="dxa" w:w="1131"/>
+            <w:vAlign w:val="center"/>
+          </w:tcPr>
+          <w:p>
+            <w:pPr>
+              <w:spacing w:after="0"/>
+            </w:pPr>
+            <w:r>
+              <w:rPr>
+                <w:sz w:val="16"/>
+              </w:rPr>
+              <w:t>170</w:t>
+            </w:r>
+          </w:p>
+        </w:tc>
+        <w:tc>
+          <w:tcPr>
+            <w:tcW w:type="dxa" w:w="1131"/>
+            <w:vAlign w:val="center"/>
+          </w:tcPr>
+          <w:p>
+            <w:pPr>
+              <w:spacing w:after="0"/>
+            </w:pPr>
+            <w:r>
+              <w:rPr>
+                <w:sz w:val="16"/>
+              </w:rPr>
+              <w:t>0</w:t>
+            </w:r>
+          </w:p>
+        </w:tc>
+        <w:tc>
+          <w:tcPr>
+            <w:tcW w:type="dxa" w:w="1131"/>
+            <w:vAlign w:val="center"/>
+          </w:tcPr>
+          <w:p>
+            <w:pPr>
+              <w:spacing w:after="0"/>
+            </w:pPr>
+            <w:r>
+              <w:rPr>
+                <w:sz w:val="16"/>
+              </w:rPr>
+              <w:t>0</w:t>
+            </w:r>
+          </w:p>
+        </w:tc>
+        <w:tc>
+          <w:tcPr>
+            <w:tcW w:type="dxa" w:w="1131"/>
+            <w:vAlign w:val="center"/>
+          </w:tcPr>
+          <w:p>
+            <w:pPr>
+              <w:spacing w:after="0"/>
+            </w:pPr>
+            <w:r>
+              <w:rPr>
+                <w:sz w:val="16"/>
+              </w:rPr>
+              <w:t>130</w:t>
+            </w:r>
+          </w:p>
+        </w:tc>
+        <w:tc>
+          <w:tcPr>
+            <w:tcW w:type="dxa" w:w="1131"/>
+            <w:vAlign w:val="center"/>
+          </w:tcPr>
+          <w:p>
+            <w:pPr>
+              <w:spacing w:after="0"/>
+            </w:pPr>
+            <w:r>
+              <w:rPr>
+                <w:sz w:val="16"/>
+              </w:rPr>
+              <w:t>0</w:t>
+            </w:r>
+          </w:p>
+        </w:tc>
+        <w:tc>
+          <w:tcPr>
+            <w:tcW w:type="dxa" w:w="1131"/>
+            <w:vAlign w:val="center"/>
+          </w:tcPr>
+          <w:p>
+            <w:pPr>
+              <w:spacing w:after="0"/>
+            </w:pPr>
+            <w:r>
+              <w:rPr>
+                <w:sz w:val="16"/>
+              </w:rPr>
+              <w:t>0</w:t>
+            </w:r>
+          </w:p>
+        </w:tc>
+        <w:tc>
+          <w:tcPr>
+            <w:tcW w:type="dxa" w:w="1134"/>
+            <w:vAlign w:val="center"/>
+          </w:tcPr>
+          <w:p>
+            <w:pPr>
+              <w:spacing w:after="0"/>
+            </w:pPr>
+            <w:r>
+              <w:rPr>
+                <w:sz w:val="16"/>
+              </w:rPr>
+              <w:t>0</w:t>
+            </w:r>
+          </w:p>
+        </w:tc>
+      </w:tr>
+      <w:tr>
+        <w:tc>
+          <w:tcPr>
+            <w:tcW w:type="dxa" w:w="1440"/>
+            <w:vAlign w:val="center"/>
+          </w:tcPr>
+          <w:p>
+            <w:pPr>
+              <w:spacing w:after="0"/>
+            </w:pPr>
+            <w:r>
+              <w:rPr>
+                <w:sz w:val="16"/>
+              </w:rPr>
+              <w:t>Rangpur</w:t>
+            </w:r>
+          </w:p>
+        </w:tc>
+        <w:tc>
+          <w:tcPr>
+            <w:tcW w:type="dxa" w:w="1131"/>
+            <w:vAlign w:val="center"/>
+          </w:tcPr>
+          <w:p>
+            <w:pPr>
+              <w:spacing w:after="0"/>
+            </w:pPr>
+            <w:r>
+              <w:rPr>
+                <w:sz w:val="16"/>
+              </w:rPr>
+              <w:t>300</w:t>
+            </w:r>
+          </w:p>
+        </w:tc>
+        <w:tc>
+          <w:tcPr>
+            <w:tcW w:type="dxa" w:w="1131"/>
+            <w:vAlign w:val="center"/>
+          </w:tcPr>
+          <w:p>
+            <w:pPr>
+              <w:spacing w:after="0"/>
+            </w:pPr>
+            <w:r>
+              <w:rPr>
+                <w:sz w:val="16"/>
+              </w:rPr>
+              <w:t>0</w:t>
+            </w:r>
+          </w:p>
+        </w:tc>
+        <w:tc>
+          <w:tcPr>
+            <w:tcW w:type="dxa" w:w="1131"/>
+            <w:vAlign w:val="center"/>
+          </w:tcPr>
+          <w:p>
+            <w:pPr>
+              <w:spacing w:after="0"/>
+            </w:pPr>
+            <w:r>
+              <w:rPr>
+                <w:sz w:val="16"/>
+              </w:rPr>
+              <w:t>0</w:t>
+            </w:r>
+          </w:p>
+        </w:tc>
+        <w:tc>
+          <w:tcPr>
+            <w:tcW w:type="dxa" w:w="1131"/>
+            <w:vAlign w:val="center"/>
+          </w:tcPr>
+          <w:p>
+            <w:pPr>
+              <w:spacing w:after="0"/>
+            </w:pPr>
+            <w:r>
+              <w:rPr>
+                <w:sz w:val="16"/>
+              </w:rPr>
+              <w:t>0</w:t>
+            </w:r>
+          </w:p>
+        </w:tc>
+        <w:tc>
+          <w:tcPr>
+            <w:tcW w:type="dxa" w:w="1131"/>
+            <w:vAlign w:val="center"/>
+          </w:tcPr>
+          <w:p>
+            <w:pPr>
+              <w:spacing w:after="0"/>
+            </w:pPr>
+            <w:r>
+              <w:rPr>
+                <w:sz w:val="16"/>
+              </w:rPr>
+              <w:t>130</w:t>
+            </w:r>
+          </w:p>
+        </w:tc>
+        <w:tc>
+          <w:tcPr>
+            <w:tcW w:type="dxa" w:w="1131"/>
+            <w:vAlign w:val="center"/>
+          </w:tcPr>
+          <w:p>
+            <w:pPr>
+              <w:spacing w:after="0"/>
+            </w:pPr>
+            <w:r>
+              <w:rPr>
+                <w:sz w:val="16"/>
+              </w:rPr>
+              <w:t>0</w:t>
+            </w:r>
+          </w:p>
+        </w:tc>
+        <w:tc>
+          <w:tcPr>
+            <w:tcW w:type="dxa" w:w="1134"/>
+            <w:vAlign w:val="center"/>
+          </w:tcPr>
+          <w:p>
+            <w:pPr>
+              <w:spacing w:after="0"/>
+            </w:pPr>
+            <w:r>
+              <w:rPr>
+                <w:sz w:val="16"/>
+              </w:rPr>
+              <w:t>0</w:t>
+            </w:r>
+          </w:p>
+        </w:tc>
+      </w:tr>
+    </w:tbl>
+    <w:p>
+      <w:pPr>
+        <w:pStyle w:val="Heading2"/>
+      </w:pPr>
+      <w:r>
+        <w:t>7.3 Interpretation, limitations, and verification</w:t>
+      </w:r>
+    </w:p>
+    <w:p>
+      <w:pPr>
+        <w:widowControl/>
+      </w:pPr>
+      <w:r>
+        <w:t>Symmetry was produced because every route was encoded as an undirected edge with one shared weight. An asymmetric matrix would be expected under one-way travel or direction-dependent cost. The adjacency list was better suited to neighbor inspection, while the matrix supported exact pairwise lookup.</w:t>
+      </w:r>
+    </w:p>
+    <w:p>
+      <w:pPr>
+        <w:widowControl/>
+      </w:pPr>
+      <w:r>
+        <w:t>The graph was treated as a classroom illustration rather than a complete transportation model. The matrix was saved as a CSV, and symmetry is covered by an automated graph-representation test.</w:t>
       </w:r>
     </w:p>
     <w:p>
@@ -1202,7 +2486,55 @@
         <w:widowControl/>
       </w:pPr>
       <w:r>
-        <w:t>Kamada-Kawai is selected as the clearest layout for this exact 15-node G_ppi realization because it minimizes pairwise distance stress and makes ring locality plus rewired shortcuts legible. The measured average clustering is 0.000; no layout can reveal triangle-based clustering that is absent. Spring is a close alternative, and the judgment is not universal.</w:t>
+        <w:t>Six layouts were compared for one unchanged G_ppi topology. Identity, labels, node size, color, and edges were fixed so that placement was the only changing visual variable.</w:t>
+      </w:r>
+    </w:p>
+    <w:p>
+      <w:pPr>
+        <w:pStyle w:val="Heading2"/>
+      </w:pPr>
+      <w:r>
+        <w:t>8.1 Graph construction and controlled procedure</w:t>
+      </w:r>
+    </w:p>
+    <w:p>
+      <w:pPr>
+        <w:widowControl/>
+      </w:pPr>
+      <w:r>
+        <w:t>The graph was reproduced with nx.watts_strogatz_graph using n=15, k=3, p=0.3, and seed 42, then relabeled P1 through P15. The realization contains 15 edges, density 0.1429, average degree 2.00, diameter 8, and degree range 1-4.</w:t>
+      </w:r>
+    </w:p>
+    <w:p>
+      <w:pPr>
+        <w:widowControl/>
+      </w:pPr>
+      <w:r>
+        <w:t>Spring, circular, shell, spectral, Kamada-Kawai, and random placement were assessed through crossings, label separation, ring locality, shortcut visibility, and correspondence between graph distance and visual proximity.</w:t>
+      </w:r>
+    </w:p>
+    <w:p>
+      <w:pPr>
+        <w:pStyle w:val="Heading2"/>
+      </w:pPr>
+      <w:r>
+        <w:t>8.2 Verified result and critical interpretation</w:t>
+      </w:r>
+    </w:p>
+    <w:p>
+      <w:pPr>
+        <w:widowControl/>
+      </w:pPr>
+      <w:r>
+        <w:t>Kamada-Kawai was selected for this realization because pairwise distance stress was minimized and ring-like locality remained legible. Spring placement was a close alternative.</w:t>
+      </w:r>
+    </w:p>
+    <w:p>
+      <w:pPr>
+        <w:widowControl/>
+      </w:pPr>
+      <w:r>
+        <w:t>Average clustering was 0.000. Triangle-based clustering was absent in this exact seeded graph, so the layouts were interpreted as views of locality and shortcuts rather than as evidence of communities.</w:t>
       </w:r>
     </w:p>
     <w:p>
@@ -1213,7 +2545,7 @@
         <w:drawing>
           <wp:inline xmlns:a="http://schemas.openxmlformats.org/drawingml/2006/main" xmlns:pic="http://schemas.openxmlformats.org/drawingml/2006/picture">
             <wp:extent cx="5623560" cy="3483778"/>
-            <wp:docPr id="3" name="Picture 3" descr="Comparison of spring, circular, shell, spectral, Kamada-Kawai, and random layouts."/>
+            <wp:docPr id="4" name="Picture 4" descr="Spring, circular, shell, spectral, Kamada-Kawai, and random layouts of one graph."/>
             <wp:cNvGraphicFramePr>
               <a:graphicFrameLocks noChangeAspect="1"/>
             </wp:cNvGraphicFramePr>
@@ -1225,7 +2557,7 @@
                     <pic:cNvPicPr/>
                   </pic:nvPicPr>
                   <pic:blipFill>
-                    <a:blip r:embed="rId13"/>
+                    <a:blip r:embed="rId14"/>
                     <a:stretch>
                       <a:fillRect/>
                     </a:stretch>
@@ -1255,7 +2587,23 @@
           <w:i/>
           <w:sz w:val="18"/>
         </w:rPr>
-        <w:t>Figure 3. Six layouts of the identical synthetic G_ppi graph.</w:t>
+        <w:t>Figure 4. Six layouts of the identical synthetic G_ppi graph.</w:t>
+      </w:r>
+    </w:p>
+    <w:p>
+      <w:pPr>
+        <w:pStyle w:val="Heading2"/>
+      </w:pPr>
+      <w:r>
+        <w:t>8.3 Limitations and verification</w:t>
+      </w:r>
+    </w:p>
+    <w:p>
+      <w:pPr>
+        <w:widowControl/>
+      </w:pPr>
+      <w:r>
+        <w:t>Layout preference remains dependent on graph size, parameters, task, and labeling. Six individual figures and a combined comparison were saved, and all reported graph statistics were recalculated from the generated NetworkX object.</w:t>
       </w:r>
     </w:p>
     <w:p>
@@ -1271,7 +2619,348 @@
         <w:widowControl/>
       </w:pPr>
       <w:r>
-        <w:t>The stored CSV tables form a valid bipartite graph with 40 enrollments. Data Visualization is most popular, and Imran Kabir takes the largest number of courses.</w:t>
+        <w:t>A two-mode enrollment network was constructed without inventing student-student or course-course edges.</w:t>
+      </w:r>
+    </w:p>
+    <w:p>
+      <w:pPr>
+        <w:pStyle w:val="Heading2"/>
+      </w:pPr>
+      <w:r>
+        <w:t>9.1 Data design, construction procedure, and validation</w:t>
+      </w:r>
+    </w:p>
+    <w:p>
+      <w:pPr>
+        <w:widowControl/>
+      </w:pPr>
+      <w:r>
+        <w:t>The stored synthetic data contain 12 students, 6 courses, and 40 enrollment records. Students were assigned to partition 0 and courses to partition 1.</w:t>
+      </w:r>
+    </w:p>
+    <w:p>
+      <w:pPr>
+        <w:widowControl/>
+      </w:pPr>
+      <w:r>
+        <w:t>An edge was added only when a stored enrollment linked the two partitions. Bipartiteness returned True, and bipartite density was 0.5556.</w:t>
+      </w:r>
+    </w:p>
+    <w:p>
+      <w:pPr>
+        <w:pStyle w:val="Heading2"/>
+      </w:pPr>
+      <w:r>
+        <w:t>9.2 Degree results</w:t>
+      </w:r>
+    </w:p>
+    <w:p>
+      <w:pPr>
+        <w:widowControl/>
+      </w:pPr>
+      <w:r>
+        <w:t>Mean course load was 3.33 per student, and mean course enrollment was 6.67. Data Visualization had the largest course degree (12), while Imran Kabir had the largest student degree (5).</w:t>
+      </w:r>
+    </w:p>
+    <w:p>
+      <w:pPr>
+        <w:spacing w:before="80" w:after="80"/>
+      </w:pPr>
+      <w:r>
+        <w:rPr>
+          <w:b/>
+          <w:sz w:val="19"/>
+        </w:rPr>
+        <w:t>Table 3. Enrollment degree by course</w:t>
+      </w:r>
+    </w:p>
+    <w:tbl>
+      <w:tblPr>
+        <w:tblStyle w:val="TableGrid"/>
+        <w:tblW w:type="dxa" w:w="9360"/>
+        <w:jc w:val="left"/>
+        <w:tblLayout w:type="fixed"/>
+        <w:tblLook w:firstColumn="1" w:firstRow="1" w:lastColumn="0" w:lastRow="0" w:noHBand="0" w:noVBand="1" w:val="04A0"/>
+        <w:tblInd w:w="120" w:type="dxa"/>
+        <w:tblCellMar>
+          <w:top w:w="80" w:type="dxa"/>
+          <w:bottom w:w="80" w:type="dxa"/>
+          <w:start w:w="120" w:type="dxa"/>
+          <w:end w:w="120" w:type="dxa"/>
+        </w:tblCellMar>
+      </w:tblPr>
+      <w:tblGrid>
+        <w:gridCol w:w="6912"/>
+        <w:gridCol w:w="2448"/>
+      </w:tblGrid>
+      <w:tr>
+        <w:trPr>
+          <w:tblHeader w:val="true"/>
+        </w:trPr>
+        <w:tc>
+          <w:tcPr>
+            <w:tcW w:type="dxa" w:w="6912"/>
+            <w:shd w:fill="E9EEF3"/>
+            <w:vAlign w:val="center"/>
+          </w:tcPr>
+          <w:p>
+            <w:r>
+              <w:rPr>
+                <w:b/>
+                <w:sz w:val="17"/>
+              </w:rPr>
+              <w:t>Course</w:t>
+            </w:r>
+          </w:p>
+        </w:tc>
+        <w:tc>
+          <w:tcPr>
+            <w:tcW w:type="dxa" w:w="2448"/>
+            <w:shd w:fill="E9EEF3"/>
+            <w:vAlign w:val="center"/>
+          </w:tcPr>
+          <w:p>
+            <w:r>
+              <w:rPr>
+                <w:b/>
+                <w:sz w:val="17"/>
+              </w:rPr>
+              <w:t>Student enrollments</w:t>
+            </w:r>
+          </w:p>
+        </w:tc>
+      </w:tr>
+      <w:tr>
+        <w:tc>
+          <w:tcPr>
+            <w:tcW w:type="dxa" w:w="6912"/>
+            <w:vAlign w:val="center"/>
+          </w:tcPr>
+          <w:p>
+            <w:pPr>
+              <w:spacing w:after="0"/>
+            </w:pPr>
+            <w:r>
+              <w:rPr>
+                <w:sz w:val="16"/>
+              </w:rPr>
+              <w:t>Data Visualization</w:t>
+            </w:r>
+          </w:p>
+        </w:tc>
+        <w:tc>
+          <w:tcPr>
+            <w:tcW w:type="dxa" w:w="2448"/>
+            <w:vAlign w:val="center"/>
+          </w:tcPr>
+          <w:p>
+            <w:pPr>
+              <w:spacing w:after="0"/>
+            </w:pPr>
+            <w:r>
+              <w:rPr>
+                <w:sz w:val="16"/>
+              </w:rPr>
+              <w:t>12</w:t>
+            </w:r>
+          </w:p>
+        </w:tc>
+      </w:tr>
+      <w:tr>
+        <w:tc>
+          <w:tcPr>
+            <w:tcW w:type="dxa" w:w="6912"/>
+            <w:vAlign w:val="center"/>
+          </w:tcPr>
+          <w:p>
+            <w:pPr>
+              <w:spacing w:after="0"/>
+            </w:pPr>
+            <w:r>
+              <w:rPr>
+                <w:sz w:val="16"/>
+              </w:rPr>
+              <w:t>Machine Learning</w:t>
+            </w:r>
+          </w:p>
+        </w:tc>
+        <w:tc>
+          <w:tcPr>
+            <w:tcW w:type="dxa" w:w="2448"/>
+            <w:vAlign w:val="center"/>
+          </w:tcPr>
+          <w:p>
+            <w:pPr>
+              <w:spacing w:after="0"/>
+            </w:pPr>
+            <w:r>
+              <w:rPr>
+                <w:sz w:val="16"/>
+              </w:rPr>
+              <w:t>7</w:t>
+            </w:r>
+          </w:p>
+        </w:tc>
+      </w:tr>
+      <w:tr>
+        <w:tc>
+          <w:tcPr>
+            <w:tcW w:type="dxa" w:w="6912"/>
+            <w:vAlign w:val="center"/>
+          </w:tcPr>
+          <w:p>
+            <w:pPr>
+              <w:spacing w:after="0"/>
+            </w:pPr>
+            <w:r>
+              <w:rPr>
+                <w:sz w:val="16"/>
+              </w:rPr>
+              <w:t>Social Network Analysis</w:t>
+            </w:r>
+          </w:p>
+        </w:tc>
+        <w:tc>
+          <w:tcPr>
+            <w:tcW w:type="dxa" w:w="2448"/>
+            <w:vAlign w:val="center"/>
+          </w:tcPr>
+          <w:p>
+            <w:pPr>
+              <w:spacing w:after="0"/>
+            </w:pPr>
+            <w:r>
+              <w:rPr>
+                <w:sz w:val="16"/>
+              </w:rPr>
+              <w:t>6</w:t>
+            </w:r>
+          </w:p>
+        </w:tc>
+      </w:tr>
+      <w:tr>
+        <w:tc>
+          <w:tcPr>
+            <w:tcW w:type="dxa" w:w="6912"/>
+            <w:vAlign w:val="center"/>
+          </w:tcPr>
+          <w:p>
+            <w:pPr>
+              <w:spacing w:after="0"/>
+            </w:pPr>
+            <w:r>
+              <w:rPr>
+                <w:sz w:val="16"/>
+              </w:rPr>
+              <w:t>Database Systems</w:t>
+            </w:r>
+          </w:p>
+        </w:tc>
+        <w:tc>
+          <w:tcPr>
+            <w:tcW w:type="dxa" w:w="2448"/>
+            <w:vAlign w:val="center"/>
+          </w:tcPr>
+          <w:p>
+            <w:pPr>
+              <w:spacing w:after="0"/>
+            </w:pPr>
+            <w:r>
+              <w:rPr>
+                <w:sz w:val="16"/>
+              </w:rPr>
+              <w:t>5</w:t>
+            </w:r>
+          </w:p>
+        </w:tc>
+      </w:tr>
+      <w:tr>
+        <w:tc>
+          <w:tcPr>
+            <w:tcW w:type="dxa" w:w="6912"/>
+            <w:vAlign w:val="center"/>
+          </w:tcPr>
+          <w:p>
+            <w:pPr>
+              <w:spacing w:after="0"/>
+            </w:pPr>
+            <w:r>
+              <w:rPr>
+                <w:sz w:val="16"/>
+              </w:rPr>
+              <w:t>Human-Computer Interaction</w:t>
+            </w:r>
+          </w:p>
+        </w:tc>
+        <w:tc>
+          <w:tcPr>
+            <w:tcW w:type="dxa" w:w="2448"/>
+            <w:vAlign w:val="center"/>
+          </w:tcPr>
+          <w:p>
+            <w:pPr>
+              <w:spacing w:after="0"/>
+            </w:pPr>
+            <w:r>
+              <w:rPr>
+                <w:sz w:val="16"/>
+              </w:rPr>
+              <w:t>5</w:t>
+            </w:r>
+          </w:p>
+        </w:tc>
+      </w:tr>
+      <w:tr>
+        <w:tc>
+          <w:tcPr>
+            <w:tcW w:type="dxa" w:w="6912"/>
+            <w:vAlign w:val="center"/>
+          </w:tcPr>
+          <w:p>
+            <w:pPr>
+              <w:spacing w:after="0"/>
+            </w:pPr>
+            <w:r>
+              <w:rPr>
+                <w:sz w:val="16"/>
+              </w:rPr>
+              <w:t>Research Methodology</w:t>
+            </w:r>
+          </w:p>
+        </w:tc>
+        <w:tc>
+          <w:tcPr>
+            <w:tcW w:type="dxa" w:w="2448"/>
+            <w:vAlign w:val="center"/>
+          </w:tcPr>
+          <w:p>
+            <w:pPr>
+              <w:spacing w:after="0"/>
+            </w:pPr>
+            <w:r>
+              <w:rPr>
+                <w:sz w:val="16"/>
+              </w:rPr>
+              <w:t>5</w:t>
+            </w:r>
+          </w:p>
+        </w:tc>
+      </w:tr>
+    </w:tbl>
+    <w:p>
+      <w:pPr>
+        <w:pStyle w:val="Heading2"/>
+      </w:pPr>
+      <w:r>
+        <w:t>9.3 Visual result and interpretation</w:t>
+      </w:r>
+    </w:p>
+    <w:p>
+      <w:pPr>
+        <w:widowControl/>
+      </w:pPr>
+      <w:r>
+        <w:t>Separate columns, shapes, and colors made partition membership explicit. Student degree represented course load, whereas course degree represented synthetic popularity. A one-mode projection was not used because derived ties were outside the exercise scope.</w:t>
       </w:r>
     </w:p>
     <w:p>
@@ -1290,7 +2979,7 @@
         <w:drawing>
           <wp:inline xmlns:a="http://schemas.openxmlformats.org/drawingml/2006/main" xmlns:pic="http://schemas.openxmlformats.org/drawingml/2006/picture">
             <wp:extent cx="5623560" cy="4344940"/>
-            <wp:docPr id="4" name="Picture 4" descr="Bipartite graph with student circles and course squares."/>
+            <wp:docPr id="5" name="Picture 5" descr="Bipartite graph with student circles and course squares."/>
             <wp:cNvGraphicFramePr>
               <a:graphicFrameLocks noChangeAspect="1"/>
             </wp:cNvGraphicFramePr>
@@ -1302,7 +2991,7 @@
                     <pic:cNvPicPr/>
                   </pic:nvPicPr>
                   <pic:blipFill>
-                    <a:blip r:embed="rId14"/>
+                    <a:blip r:embed="rId15"/>
                     <a:stretch>
                       <a:fillRect/>
                     </a:stretch>
@@ -1332,7 +3021,23 @@
           <w:i/>
           <w:sz w:val="18"/>
         </w:rPr>
-        <w:t>Figure 4. Synthetic student-course enrollment network.</w:t>
+        <w:t>Figure 5. Synthetic student-course enrollment network.</w:t>
+      </w:r>
+    </w:p>
+    <w:p>
+      <w:pPr>
+        <w:pStyle w:val="Heading2"/>
+      </w:pPr>
+      <w:r>
+        <w:t>9.4 Limitations and verification</w:t>
+      </w:r>
+    </w:p>
+    <w:p>
+      <w:pPr>
+        <w:widowControl/>
+      </w:pPr>
+      <w:r>
+        <w:t>Names and enrollment records were generated solely for teaching. No claim was made about actual students or enrollment behavior. Source tables, calculated degree results, and an automated partition test provide reproduction evidence.</w:t>
       </w:r>
     </w:p>
     <w:p>
@@ -1348,9 +3053,478 @@
         <w:widowControl/>
       </w:pPr>
       <w:r>
-        <w:t>All 196 edges received seeded integer weights from 1 to 10. Width changes tie salience but does not redefine degree-based hubs. Random weights demonstrate encoding rather than empirical importance.</w:t>
+        <w:t>The perceptual effect of edge-width encoding was examined while the underlying 100-node preferential-attachment topology was preserved.</w:t>
       </w:r>
     </w:p>
+    <w:p>
+      <w:pPr>
+        <w:pStyle w:val="Heading2"/>
+      </w:pPr>
+      <w:r>
+        <w:t>10.1 Construction and weight assignment</w:t>
+      </w:r>
+    </w:p>
+    <w:p>
+      <w:pPr>
+        <w:widowControl/>
+      </w:pPr>
+      <w:r>
+        <w:t>The topology was generated with n=100, m=2, and seed 42. It contains 196 edges, average degree 3.92, and maximum degree 36.</w:t>
+      </w:r>
+    </w:p>
+    <w:p>
+      <w:pPr>
+        <w:widowControl/>
+      </w:pPr>
+      <w:r>
+        <w:t>Each copied edge received a reproducible integer weight from 1 through 10. Edge width was scaled from weight; topology, degree, and node positions were not changed.</w:t>
+      </w:r>
+    </w:p>
+    <w:p>
+      <w:pPr>
+        <w:pStyle w:val="Heading2"/>
+      </w:pPr>
+      <w:r>
+        <w:t>10.2 Verified weight distribution</w:t>
+      </w:r>
+    </w:p>
+    <w:p>
+      <w:pPr>
+        <w:widowControl/>
+      </w:pPr>
+      <w:r>
+        <w:t>The observed range was 1-10, the mean was 5.388, the median was 5.0, and the population standard deviation was 2.852. Total assigned edge weight was 1,056.</w:t>
+      </w:r>
+    </w:p>
+    <w:p>
+      <w:pPr>
+        <w:spacing w:before="80" w:after="80"/>
+      </w:pPr>
+      <w:r>
+        <w:rPr>
+          <w:b/>
+          <w:sz w:val="19"/>
+        </w:rPr>
+        <w:t>Table 4. Frequency of assigned edge weights</w:t>
+      </w:r>
+    </w:p>
+    <w:tbl>
+      <w:tblPr>
+        <w:tblStyle w:val="TableGrid"/>
+        <w:tblW w:type="dxa" w:w="9360"/>
+        <w:jc w:val="left"/>
+        <w:tblLayout w:type="fixed"/>
+        <w:tblLook w:firstColumn="1" w:firstRow="1" w:lastColumn="0" w:lastRow="0" w:noHBand="0" w:noVBand="1" w:val="04A0"/>
+        <w:tblInd w:w="120" w:type="dxa"/>
+        <w:tblCellMar>
+          <w:top w:w="80" w:type="dxa"/>
+          <w:bottom w:w="80" w:type="dxa"/>
+          <w:start w:w="120" w:type="dxa"/>
+          <w:end w:w="120" w:type="dxa"/>
+        </w:tblCellMar>
+      </w:tblPr>
+      <w:tblGrid>
+        <w:gridCol w:w="3456"/>
+        <w:gridCol w:w="5904"/>
+      </w:tblGrid>
+      <w:tr>
+        <w:trPr>
+          <w:tblHeader w:val="true"/>
+        </w:trPr>
+        <w:tc>
+          <w:tcPr>
+            <w:tcW w:type="dxa" w:w="3456"/>
+            <w:shd w:fill="E9EEF3"/>
+            <w:vAlign w:val="center"/>
+          </w:tcPr>
+          <w:p>
+            <w:r>
+              <w:rPr>
+                <w:b/>
+                <w:sz w:val="17"/>
+              </w:rPr>
+              <w:t>Edge weight</w:t>
+            </w:r>
+          </w:p>
+        </w:tc>
+        <w:tc>
+          <w:tcPr>
+            <w:tcW w:type="dxa" w:w="5904"/>
+            <w:shd w:fill="E9EEF3"/>
+            <w:vAlign w:val="center"/>
+          </w:tcPr>
+          <w:p>
+            <w:r>
+              <w:rPr>
+                <w:b/>
+                <w:sz w:val="17"/>
+              </w:rPr>
+              <w:t>Number of edges</w:t>
+            </w:r>
+          </w:p>
+        </w:tc>
+      </w:tr>
+      <w:tr>
+        <w:tc>
+          <w:tcPr>
+            <w:tcW w:type="dxa" w:w="3456"/>
+            <w:vAlign w:val="center"/>
+          </w:tcPr>
+          <w:p>
+            <w:pPr>
+              <w:spacing w:after="0"/>
+            </w:pPr>
+            <w:r>
+              <w:rPr>
+                <w:sz w:val="16"/>
+              </w:rPr>
+              <w:t>1</w:t>
+            </w:r>
+          </w:p>
+        </w:tc>
+        <w:tc>
+          <w:tcPr>
+            <w:tcW w:type="dxa" w:w="5904"/>
+            <w:vAlign w:val="center"/>
+          </w:tcPr>
+          <w:p>
+            <w:pPr>
+              <w:spacing w:after="0"/>
+            </w:pPr>
+            <w:r>
+              <w:rPr>
+                <w:sz w:val="16"/>
+              </w:rPr>
+              <w:t>16</w:t>
+            </w:r>
+          </w:p>
+        </w:tc>
+      </w:tr>
+      <w:tr>
+        <w:tc>
+          <w:tcPr>
+            <w:tcW w:type="dxa" w:w="3456"/>
+            <w:vAlign w:val="center"/>
+          </w:tcPr>
+          <w:p>
+            <w:pPr>
+              <w:spacing w:after="0"/>
+            </w:pPr>
+            <w:r>
+              <w:rPr>
+                <w:sz w:val="16"/>
+              </w:rPr>
+              <w:t>2</w:t>
+            </w:r>
+          </w:p>
+        </w:tc>
+        <w:tc>
+          <w:tcPr>
+            <w:tcW w:type="dxa" w:w="5904"/>
+            <w:vAlign w:val="center"/>
+          </w:tcPr>
+          <w:p>
+            <w:pPr>
+              <w:spacing w:after="0"/>
+            </w:pPr>
+            <w:r>
+              <w:rPr>
+                <w:sz w:val="16"/>
+              </w:rPr>
+              <w:t>26</w:t>
+            </w:r>
+          </w:p>
+        </w:tc>
+      </w:tr>
+      <w:tr>
+        <w:tc>
+          <w:tcPr>
+            <w:tcW w:type="dxa" w:w="3456"/>
+            <w:vAlign w:val="center"/>
+          </w:tcPr>
+          <w:p>
+            <w:pPr>
+              <w:spacing w:after="0"/>
+            </w:pPr>
+            <w:r>
+              <w:rPr>
+                <w:sz w:val="16"/>
+              </w:rPr>
+              <w:t>3</w:t>
+            </w:r>
+          </w:p>
+        </w:tc>
+        <w:tc>
+          <w:tcPr>
+            <w:tcW w:type="dxa" w:w="5904"/>
+            <w:vAlign w:val="center"/>
+          </w:tcPr>
+          <w:p>
+            <w:pPr>
+              <w:spacing w:after="0"/>
+            </w:pPr>
+            <w:r>
+              <w:rPr>
+                <w:sz w:val="16"/>
+              </w:rPr>
+              <w:t>18</w:t>
+            </w:r>
+          </w:p>
+        </w:tc>
+      </w:tr>
+      <w:tr>
+        <w:tc>
+          <w:tcPr>
+            <w:tcW w:type="dxa" w:w="3456"/>
+            <w:vAlign w:val="center"/>
+          </w:tcPr>
+          <w:p>
+            <w:pPr>
+              <w:spacing w:after="0"/>
+            </w:pPr>
+            <w:r>
+              <w:rPr>
+                <w:sz w:val="16"/>
+              </w:rPr>
+              <w:t>4</w:t>
+            </w:r>
+          </w:p>
+        </w:tc>
+        <w:tc>
+          <w:tcPr>
+            <w:tcW w:type="dxa" w:w="5904"/>
+            <w:vAlign w:val="center"/>
+          </w:tcPr>
+          <w:p>
+            <w:pPr>
+              <w:spacing w:after="0"/>
+            </w:pPr>
+            <w:r>
+              <w:rPr>
+                <w:sz w:val="16"/>
+              </w:rPr>
+              <w:t>25</w:t>
+            </w:r>
+          </w:p>
+        </w:tc>
+      </w:tr>
+      <w:tr>
+        <w:tc>
+          <w:tcPr>
+            <w:tcW w:type="dxa" w:w="3456"/>
+            <w:vAlign w:val="center"/>
+          </w:tcPr>
+          <w:p>
+            <w:pPr>
+              <w:spacing w:after="0"/>
+            </w:pPr>
+            <w:r>
+              <w:rPr>
+                <w:sz w:val="16"/>
+              </w:rPr>
+              <w:t>5</w:t>
+            </w:r>
+          </w:p>
+        </w:tc>
+        <w:tc>
+          <w:tcPr>
+            <w:tcW w:type="dxa" w:w="5904"/>
+            <w:vAlign w:val="center"/>
+          </w:tcPr>
+          <w:p>
+            <w:pPr>
+              <w:spacing w:after="0"/>
+            </w:pPr>
+            <w:r>
+              <w:rPr>
+                <w:sz w:val="16"/>
+              </w:rPr>
+              <w:t>20</w:t>
+            </w:r>
+          </w:p>
+        </w:tc>
+      </w:tr>
+      <w:tr>
+        <w:tc>
+          <w:tcPr>
+            <w:tcW w:type="dxa" w:w="3456"/>
+            <w:vAlign w:val="center"/>
+          </w:tcPr>
+          <w:p>
+            <w:pPr>
+              <w:spacing w:after="0"/>
+            </w:pPr>
+            <w:r>
+              <w:rPr>
+                <w:sz w:val="16"/>
+              </w:rPr>
+              <w:t>6</w:t>
+            </w:r>
+          </w:p>
+        </w:tc>
+        <w:tc>
+          <w:tcPr>
+            <w:tcW w:type="dxa" w:w="5904"/>
+            <w:vAlign w:val="center"/>
+          </w:tcPr>
+          <w:p>
+            <w:pPr>
+              <w:spacing w:after="0"/>
+            </w:pPr>
+            <w:r>
+              <w:rPr>
+                <w:sz w:val="16"/>
+              </w:rPr>
+              <w:t>18</w:t>
+            </w:r>
+          </w:p>
+        </w:tc>
+      </w:tr>
+      <w:tr>
+        <w:tc>
+          <w:tcPr>
+            <w:tcW w:type="dxa" w:w="3456"/>
+            <w:vAlign w:val="center"/>
+          </w:tcPr>
+          <w:p>
+            <w:pPr>
+              <w:spacing w:after="0"/>
+            </w:pPr>
+            <w:r>
+              <w:rPr>
+                <w:sz w:val="16"/>
+              </w:rPr>
+              <w:t>7</w:t>
+            </w:r>
+          </w:p>
+        </w:tc>
+        <w:tc>
+          <w:tcPr>
+            <w:tcW w:type="dxa" w:w="5904"/>
+            <w:vAlign w:val="center"/>
+          </w:tcPr>
+          <w:p>
+            <w:pPr>
+              <w:spacing w:after="0"/>
+            </w:pPr>
+            <w:r>
+              <w:rPr>
+                <w:sz w:val="16"/>
+              </w:rPr>
+              <w:t>17</w:t>
+            </w:r>
+          </w:p>
+        </w:tc>
+      </w:tr>
+      <w:tr>
+        <w:tc>
+          <w:tcPr>
+            <w:tcW w:type="dxa" w:w="3456"/>
+            <w:vAlign w:val="center"/>
+          </w:tcPr>
+          <w:p>
+            <w:pPr>
+              <w:spacing w:after="0"/>
+            </w:pPr>
+            <w:r>
+              <w:rPr>
+                <w:sz w:val="16"/>
+              </w:rPr>
+              <w:t>8</w:t>
+            </w:r>
+          </w:p>
+        </w:tc>
+        <w:tc>
+          <w:tcPr>
+            <w:tcW w:type="dxa" w:w="5904"/>
+            <w:vAlign w:val="center"/>
+          </w:tcPr>
+          <w:p>
+            <w:pPr>
+              <w:spacing w:after="0"/>
+            </w:pPr>
+            <w:r>
+              <w:rPr>
+                <w:sz w:val="16"/>
+              </w:rPr>
+              <w:t>14</w:t>
+            </w:r>
+          </w:p>
+        </w:tc>
+      </w:tr>
+      <w:tr>
+        <w:tc>
+          <w:tcPr>
+            <w:tcW w:type="dxa" w:w="3456"/>
+            <w:vAlign w:val="center"/>
+          </w:tcPr>
+          <w:p>
+            <w:pPr>
+              <w:spacing w:after="0"/>
+            </w:pPr>
+            <w:r>
+              <w:rPr>
+                <w:sz w:val="16"/>
+              </w:rPr>
+              <w:t>9</w:t>
+            </w:r>
+          </w:p>
+        </w:tc>
+        <w:tc>
+          <w:tcPr>
+            <w:tcW w:type="dxa" w:w="5904"/>
+            <w:vAlign w:val="center"/>
+          </w:tcPr>
+          <w:p>
+            <w:pPr>
+              <w:spacing w:after="0"/>
+            </w:pPr>
+            <w:r>
+              <w:rPr>
+                <w:sz w:val="16"/>
+              </w:rPr>
+              <w:t>25</w:t>
+            </w:r>
+          </w:p>
+        </w:tc>
+      </w:tr>
+      <w:tr>
+        <w:tc>
+          <w:tcPr>
+            <w:tcW w:type="dxa" w:w="3456"/>
+            <w:vAlign w:val="center"/>
+          </w:tcPr>
+          <w:p>
+            <w:pPr>
+              <w:spacing w:after="0"/>
+            </w:pPr>
+            <w:r>
+              <w:rPr>
+                <w:sz w:val="16"/>
+              </w:rPr>
+              <w:t>10</w:t>
+            </w:r>
+          </w:p>
+        </w:tc>
+        <w:tc>
+          <w:tcPr>
+            <w:tcW w:type="dxa" w:w="5904"/>
+            <w:vAlign w:val="center"/>
+          </w:tcPr>
+          <w:p>
+            <w:pPr>
+              <w:spacing w:after="0"/>
+            </w:pPr>
+            <w:r>
+              <w:rPr>
+                <w:sz w:val="16"/>
+              </w:rPr>
+              <w:t>17</w:t>
+            </w:r>
+          </w:p>
+        </w:tc>
+      </w:tr>
+    </w:tbl>
     <w:p>
       <w:pPr>
         <w:jc w:val="center"/>
@@ -1359,7 +3533,7 @@
         <w:drawing>
           <wp:inline xmlns:a="http://schemas.openxmlformats.org/drawingml/2006/main" xmlns:pic="http://schemas.openxmlformats.org/drawingml/2006/picture">
             <wp:extent cx="5623560" cy="4647395"/>
-            <wp:docPr id="5" name="Picture 5" descr="Weighted synthetic scale-free graph with thicker high-weight edges."/>
+            <wp:docPr id="6" name="Picture 6" descr="Weighted synthetic preferential-attachment graph with thicker high-weight edges."/>
             <wp:cNvGraphicFramePr>
               <a:graphicFrameLocks noChangeAspect="1"/>
             </wp:cNvGraphicFramePr>
@@ -1371,7 +3545,7 @@
                     <pic:cNvPicPr/>
                   </pic:nvPicPr>
                   <pic:blipFill>
-                    <a:blip r:embed="rId15"/>
+                    <a:blip r:embed="rId16"/>
                     <a:stretch>
                       <a:fillRect/>
                     </a:stretch>
@@ -1401,7 +3575,31 @@
           <w:i/>
           <w:sz w:val="18"/>
         </w:rPr>
-        <w:t>Figure 5. Barabasi-Albert graph with normalized edge-width encoding.</w:t>
+        <w:t>Figure 6. Barabasi-Albert graph with edge-width encoding.</w:t>
+      </w:r>
+    </w:p>
+    <w:p>
+      <w:pPr>
+        <w:pStyle w:val="Heading2"/>
+      </w:pPr>
+      <w:r>
+        <w:t>10.3 Interpretation, limitations, and verification</w:t>
+      </w:r>
+    </w:p>
+    <w:p>
+      <w:pPr>
+        <w:widowControl/>
+      </w:pPr>
+      <w:r>
+        <w:t>Thicker lines increased tie salience while hub structure remained unchanged. Edge weight was not treated as node centrality. A weighted centrality analysis would require weight to be defined as strength, capacity, cost, or distance.</w:t>
+      </w:r>
+    </w:p>
+    <w:p>
+      <w:pPr>
+        <w:widowControl/>
+      </w:pPr>
+      <w:r>
+        <w:t>The random weights demonstrate encoding only. The edge table was saved, and automated tests verify graph order, size, range, and determinism.</w:t>
       </w:r>
     </w:p>
     <w:p>
@@ -1417,7 +3615,39 @@
         <w:widowControl/>
       </w:pPr>
       <w:r>
-        <w:t>Watts-Strogatz best captures high clustering and short paths; Barabasi-Albert best captures hubs and heterogeneous degree. A realistic social network may combine both, so none is universally best. Erdos-Renyi remains a useful homogeneous random baseline.</w:t>
+        <w:t>Random mixing, local clustering with rewiring, and preferential attachment were compared under the exact supplied parameters.</w:t>
+      </w:r>
+    </w:p>
+    <w:p>
+      <w:pPr>
+        <w:pStyle w:val="Heading2"/>
+      </w:pPr>
+      <w:r>
+        <w:t>11.1 Model construction, parameters, and metric procedure</w:t>
+      </w:r>
+    </w:p>
+    <w:p>
+      <w:pPr>
+        <w:widowControl/>
+      </w:pPr>
+      <w:r>
+        <w:t>Erdos-Renyi G(30, 0.08), Watts-Strogatz WS(30, 4, 0.1), and Barabasi-Albert BA(30, 2) were generated with seed 42.</w:t>
+      </w:r>
+    </w:p>
+    <w:p>
+      <w:pPr>
+        <w:widowControl/>
+      </w:pPr>
+      <w:r>
+        <w:t>Order, size, density, average degree, clustering, connectivity, components, average path length, maximum degree, and degree standard deviation were calculated. For the disconnected Erdos-Renyi graph, path length was calculated on the largest connected component.</w:t>
+      </w:r>
+    </w:p>
+    <w:p>
+      <w:pPr>
+        <w:pStyle w:val="Heading2"/>
+      </w:pPr>
+      <w:r>
+        <w:t>11.2 Verified statistical results</w:t>
       </w:r>
     </w:p>
     <w:p>
@@ -1429,25 +3659,33 @@
           <w:b/>
           <w:sz w:val="19"/>
         </w:rPr>
-        <w:t>Table 2. Statistical comparison of Section 3 models</w:t>
+        <w:t>Table 5. Statistical comparison of seeded models</w:t>
       </w:r>
     </w:p>
     <w:tbl>
       <w:tblPr>
         <w:tblStyle w:val="TableGrid"/>
-        <w:tblW w:type="auto" w:w="0"/>
-        <w:jc w:val="center"/>
+        <w:tblW w:type="dxa" w:w="9360"/>
+        <w:jc w:val="left"/>
         <w:tblLayout w:type="fixed"/>
         <w:tblLook w:firstColumn="1" w:firstRow="1" w:lastColumn="0" w:lastRow="0" w:noHBand="0" w:noVBand="1" w:val="04A0"/>
+        <w:tblInd w:w="120" w:type="dxa"/>
+        <w:tblCellMar>
+          <w:top w:w="80" w:type="dxa"/>
+          <w:bottom w:w="80" w:type="dxa"/>
+          <w:start w:w="120" w:type="dxa"/>
+          <w:end w:w="120" w:type="dxa"/>
+        </w:tblCellMar>
       </w:tblPr>
       <w:tblGrid>
-        <w:gridCol w:w="1337"/>
-        <w:gridCol w:w="1337"/>
-        <w:gridCol w:w="1337"/>
-        <w:gridCol w:w="1337"/>
-        <w:gridCol w:w="1337"/>
-        <w:gridCol w:w="1337"/>
-        <w:gridCol w:w="1337"/>
+        <w:gridCol w:w="2376"/>
+        <w:gridCol w:w="720"/>
+        <w:gridCol w:w="720"/>
+        <w:gridCol w:w="936"/>
+        <w:gridCol w:w="1008"/>
+        <w:gridCol w:w="1008"/>
+        <w:gridCol w:w="1152"/>
+        <w:gridCol w:w="1440"/>
       </w:tblGrid>
       <w:tr>
         <w:trPr>
@@ -1471,7 +3709,7 @@
         </w:tc>
         <w:tc>
           <w:tcPr>
-            <w:tcW w:type="dxa" w:w="792"/>
+            <w:tcW w:type="dxa" w:w="720"/>
             <w:shd w:fill="E9EEF3"/>
             <w:vAlign w:val="center"/>
           </w:tcPr>
@@ -1487,7 +3725,7 @@
         </w:tc>
         <w:tc>
           <w:tcPr>
-            <w:tcW w:type="dxa" w:w="792"/>
+            <w:tcW w:type="dxa" w:w="720"/>
             <w:shd w:fill="E9EEF3"/>
             <w:vAlign w:val="center"/>
           </w:tcPr>
@@ -1503,7 +3741,7 @@
         </w:tc>
         <w:tc>
           <w:tcPr>
-            <w:tcW w:type="dxa" w:w="1008"/>
+            <w:tcW w:type="dxa" w:w="936"/>
             <w:shd w:fill="E9EEF3"/>
             <w:vAlign w:val="center"/>
           </w:tcPr>
@@ -1519,7 +3757,7 @@
         </w:tc>
         <w:tc>
           <w:tcPr>
-            <w:tcW w:type="dxa" w:w="1080"/>
+            <w:tcW w:type="dxa" w:w="1008"/>
             <w:shd w:fill="E9EEF3"/>
             <w:vAlign w:val="center"/>
           </w:tcPr>
@@ -1535,7 +3773,7 @@
         </w:tc>
         <w:tc>
           <w:tcPr>
-            <w:tcW w:type="dxa" w:w="1080"/>
+            <w:tcW w:type="dxa" w:w="1008"/>
             <w:shd w:fill="E9EEF3"/>
             <w:vAlign w:val="center"/>
           </w:tcPr>
@@ -1551,7 +3789,23 @@
         </w:tc>
         <w:tc>
           <w:tcPr>
-            <w:tcW w:type="dxa" w:w="1080"/>
+            <w:tcW w:type="dxa" w:w="1152"/>
+            <w:shd w:fill="E9EEF3"/>
+            <w:vAlign w:val="center"/>
+          </w:tcPr>
+          <w:p>
+            <w:r>
+              <w:rPr>
+                <w:b/>
+                <w:sz w:val="17"/>
+              </w:rPr>
+              <w:t>Components</w:t>
+            </w:r>
+          </w:p>
+        </w:tc>
+        <w:tc>
+          <w:tcPr>
+            <w:tcW w:type="dxa" w:w="1440"/>
             <w:shd w:fill="E9EEF3"/>
             <w:vAlign w:val="center"/>
           </w:tcPr>
@@ -1586,7 +3840,7 @@
         </w:tc>
         <w:tc>
           <w:tcPr>
-            <w:tcW w:type="dxa" w:w="792"/>
+            <w:tcW w:type="dxa" w:w="720"/>
             <w:vAlign w:val="center"/>
           </w:tcPr>
           <w:p>
@@ -1603,7 +3857,7 @@
         </w:tc>
         <w:tc>
           <w:tcPr>
-            <w:tcW w:type="dxa" w:w="792"/>
+            <w:tcW w:type="dxa" w:w="720"/>
             <w:vAlign w:val="center"/>
           </w:tcPr>
           <w:p>
@@ -1620,7 +3874,7 @@
         </w:tc>
         <w:tc>
           <w:tcPr>
-            <w:tcW w:type="dxa" w:w="1008"/>
+            <w:tcW w:type="dxa" w:w="936"/>
             <w:vAlign w:val="center"/>
           </w:tcPr>
           <w:p>
@@ -1637,7 +3891,7 @@
         </w:tc>
         <w:tc>
           <w:tcPr>
-            <w:tcW w:type="dxa" w:w="1080"/>
+            <w:tcW w:type="dxa" w:w="1008"/>
             <w:vAlign w:val="center"/>
           </w:tcPr>
           <w:p>
@@ -1654,7 +3908,7 @@
         </w:tc>
         <w:tc>
           <w:tcPr>
-            <w:tcW w:type="dxa" w:w="1080"/>
+            <w:tcW w:type="dxa" w:w="1008"/>
             <w:vAlign w:val="center"/>
           </w:tcPr>
           <w:p>
@@ -1671,7 +3925,24 @@
         </w:tc>
         <w:tc>
           <w:tcPr>
-            <w:tcW w:type="dxa" w:w="1080"/>
+            <w:tcW w:type="dxa" w:w="1152"/>
+            <w:vAlign w:val="center"/>
+          </w:tcPr>
+          <w:p>
+            <w:pPr>
+              <w:spacing w:after="0"/>
+            </w:pPr>
+            <w:r>
+              <w:rPr>
+                <w:sz w:val="16"/>
+              </w:rPr>
+              <w:t>3</w:t>
+            </w:r>
+          </w:p>
+        </w:tc>
+        <w:tc>
+          <w:tcPr>
+            <w:tcW w:type="dxa" w:w="1440"/>
             <w:vAlign w:val="center"/>
           </w:tcPr>
           <w:p>
@@ -1707,7 +3978,7 @@
         </w:tc>
         <w:tc>
           <w:tcPr>
-            <w:tcW w:type="dxa" w:w="792"/>
+            <w:tcW w:type="dxa" w:w="720"/>
             <w:vAlign w:val="center"/>
           </w:tcPr>
           <w:p>
@@ -1724,7 +3995,7 @@
         </w:tc>
         <w:tc>
           <w:tcPr>
-            <w:tcW w:type="dxa" w:w="792"/>
+            <w:tcW w:type="dxa" w:w="720"/>
             <w:vAlign w:val="center"/>
           </w:tcPr>
           <w:p>
@@ -1741,7 +4012,7 @@
         </w:tc>
         <w:tc>
           <w:tcPr>
-            <w:tcW w:type="dxa" w:w="1008"/>
+            <w:tcW w:type="dxa" w:w="936"/>
             <w:vAlign w:val="center"/>
           </w:tcPr>
           <w:p>
@@ -1758,7 +4029,7 @@
         </w:tc>
         <w:tc>
           <w:tcPr>
-            <w:tcW w:type="dxa" w:w="1080"/>
+            <w:tcW w:type="dxa" w:w="1008"/>
             <w:vAlign w:val="center"/>
           </w:tcPr>
           <w:p>
@@ -1775,7 +4046,7 @@
         </w:tc>
         <w:tc>
           <w:tcPr>
-            <w:tcW w:type="dxa" w:w="1080"/>
+            <w:tcW w:type="dxa" w:w="1008"/>
             <w:vAlign w:val="center"/>
           </w:tcPr>
           <w:p>
@@ -1792,7 +4063,24 @@
         </w:tc>
         <w:tc>
           <w:tcPr>
-            <w:tcW w:type="dxa" w:w="1080"/>
+            <w:tcW w:type="dxa" w:w="1152"/>
+            <w:vAlign w:val="center"/>
+          </w:tcPr>
+          <w:p>
+            <w:pPr>
+              <w:spacing w:after="0"/>
+            </w:pPr>
+            <w:r>
+              <w:rPr>
+                <w:sz w:val="16"/>
+              </w:rPr>
+              <w:t>1</w:t>
+            </w:r>
+          </w:p>
+        </w:tc>
+        <w:tc>
+          <w:tcPr>
+            <w:tcW w:type="dxa" w:w="1440"/>
             <w:vAlign w:val="center"/>
           </w:tcPr>
           <w:p>
@@ -1828,7 +4116,7 @@
         </w:tc>
         <w:tc>
           <w:tcPr>
-            <w:tcW w:type="dxa" w:w="792"/>
+            <w:tcW w:type="dxa" w:w="720"/>
             <w:vAlign w:val="center"/>
           </w:tcPr>
           <w:p>
@@ -1845,7 +4133,7 @@
         </w:tc>
         <w:tc>
           <w:tcPr>
-            <w:tcW w:type="dxa" w:w="792"/>
+            <w:tcW w:type="dxa" w:w="720"/>
             <w:vAlign w:val="center"/>
           </w:tcPr>
           <w:p>
@@ -1862,7 +4150,7 @@
         </w:tc>
         <w:tc>
           <w:tcPr>
-            <w:tcW w:type="dxa" w:w="1008"/>
+            <w:tcW w:type="dxa" w:w="936"/>
             <w:vAlign w:val="center"/>
           </w:tcPr>
           <w:p>
@@ -1879,7 +4167,7 @@
         </w:tc>
         <w:tc>
           <w:tcPr>
-            <w:tcW w:type="dxa" w:w="1080"/>
+            <w:tcW w:type="dxa" w:w="1008"/>
             <w:vAlign w:val="center"/>
           </w:tcPr>
           <w:p>
@@ -1896,7 +4184,7 @@
         </w:tc>
         <w:tc>
           <w:tcPr>
-            <w:tcW w:type="dxa" w:w="1080"/>
+            <w:tcW w:type="dxa" w:w="1008"/>
             <w:vAlign w:val="center"/>
           </w:tcPr>
           <w:p>
@@ -1913,7 +4201,24 @@
         </w:tc>
         <w:tc>
           <w:tcPr>
-            <w:tcW w:type="dxa" w:w="1080"/>
+            <w:tcW w:type="dxa" w:w="1152"/>
+            <w:vAlign w:val="center"/>
+          </w:tcPr>
+          <w:p>
+            <w:pPr>
+              <w:spacing w:after="0"/>
+            </w:pPr>
+            <w:r>
+              <w:rPr>
+                <w:sz w:val="16"/>
+              </w:rPr>
+              <w:t>1</w:t>
+            </w:r>
+          </w:p>
+        </w:tc>
+        <w:tc>
+          <w:tcPr>
+            <w:tcW w:type="dxa" w:w="1440"/>
             <w:vAlign w:val="center"/>
           </w:tcPr>
           <w:p>
@@ -1938,7 +4243,7 @@
         <w:drawing>
           <wp:inline xmlns:a="http://schemas.openxmlformats.org/drawingml/2006/main" xmlns:pic="http://schemas.openxmlformats.org/drawingml/2006/picture">
             <wp:extent cx="5623560" cy="1681526"/>
-            <wp:docPr id="6" name="Picture 6" descr="Side-by-side degree histograms for three synthetic graph models."/>
+            <wp:docPr id="7" name="Picture 7" descr="Degree histograms for Erdos-Renyi, Watts-Strogatz, and Barabasi-Albert graphs."/>
             <wp:cNvGraphicFramePr>
               <a:graphicFrameLocks noChangeAspect="1"/>
             </wp:cNvGraphicFramePr>
@@ -1950,7 +4255,7 @@
                     <pic:cNvPicPr/>
                   </pic:nvPicPr>
                   <pic:blipFill>
-                    <a:blip r:embed="rId16"/>
+                    <a:blip r:embed="rId17"/>
                     <a:stretch>
                       <a:fillRect/>
                     </a:stretch>
@@ -1980,7 +4285,63 @@
           <w:i/>
           <w:sz w:val="18"/>
         </w:rPr>
-        <w:t>Figure 6. Degree distributions of the three Section 3 models.</w:t>
+        <w:t>Figure 7. Degree distributions of the three seeded models.</w:t>
+      </w:r>
+    </w:p>
+    <w:p>
+      <w:pPr>
+        <w:pStyle w:val="Heading2"/>
+      </w:pPr>
+      <w:r>
+        <w:t>11.3 Model-by-model interpretation</w:t>
+      </w:r>
+    </w:p>
+    <w:p>
+      <w:pPr>
+        <w:widowControl/>
+      </w:pPr>
+      <w:r>
+        <w:t>The Erdos-Renyi realization produced three components and low clustering (0.072); it served as a homogeneous random baseline.</w:t>
+      </w:r>
+    </w:p>
+    <w:p>
+      <w:pPr>
+        <w:widowControl/>
+      </w:pPr>
+      <w:r>
+        <w:t>The Watts-Strogatz realization remained connected and produced the highest clustering (0.346) with a narrow degree distribution.</w:t>
+      </w:r>
+    </w:p>
+    <w:p>
+      <w:pPr>
+        <w:widowControl/>
+      </w:pPr>
+      <w:r>
+        <w:t>The Barabasi-Albert realization remained connected, produced the shortest average path (2.182), and generated maximum degree 18 with strong degree heterogeneity.</w:t>
+      </w:r>
+    </w:p>
+    <w:p>
+      <w:pPr>
+        <w:widowControl/>
+      </w:pPr>
+      <w:r>
+        <w:t>Watts-Strogatz captures clustering and short paths; Barabasi-Albert captures hubs and heterogeneous degree. A social network can require both properties, so no model is universally best.</w:t>
+      </w:r>
+    </w:p>
+    <w:p>
+      <w:pPr>
+        <w:pStyle w:val="Heading2"/>
+      </w:pPr>
+      <w:r>
+        <w:t>11.4 Limitations and verification</w:t>
+      </w:r>
+    </w:p>
+    <w:p>
+      <w:pPr>
+        <w:widowControl/>
+      </w:pPr>
+      <w:r>
+        <w:t>Only one small seeded realization was compared per model. Repeated simulation and uncertainty intervals would be required for general model inference. The comparison CSV and separate degree-distribution figures provide reproduction evidence.</w:t>
       </w:r>
     </w:p>
     <w:p>
@@ -1996,15 +4357,15 @@
         <w:widowControl/>
       </w:pPr>
       <w:r>
-        <w:t>The Plotly dashboard preserves node positions while a dropdown switches between categorical interest-group color and continuous in-degree color. Hover information reports node ID, group, in-degree, and out-degree, and edges remain visible in both modes.</w:t>
+        <w:t>One directed graph was interpreted through categorical interest-group color and continuous in-degree color without changing node positions.</w:t>
       </w:r>
     </w:p>
     <w:p>
       <w:pPr>
-        <w:pStyle w:val="Heading1"/>
+        <w:pStyle w:val="Heading2"/>
       </w:pPr>
       <w:r>
-        <w:t>13. Exercise 7 - Applied AI and Multimedia research graph</w:t>
+        <w:t>12.1 Graph construction procedure and results</w:t>
       </w:r>
     </w:p>
     <w:p>
@@ -2012,7 +4373,7 @@
         <w:widowControl/>
       </w:pPr>
       <w:r>
-        <w:t>Recommendation Systems is the strongest bridge by betweenness, linking research themes, technical methods, and application outcomes. The graph is synthetic and demonstrates structural interpretation, not empirical evidence about a real research community.</w:t>
+        <w:t>The seeded logic produced 20 users and 52 directed follow edges. Directed density was 0.1368. Mean in-degree was 2.60; in-degree ranged from 1 to 5, and out-degree ranged from 1 to 5.</w:t>
       </w:r>
     </w:p>
     <w:p>
@@ -2020,9 +4381,1097 @@
         <w:widowControl/>
       </w:pPr>
       <w:r>
-        <w:t>The graph is synthetic and demonstrates centrality interpretation rather than empirical evidence about a research community.</w:t>
+        <w:t>The three largest in-degree results were user_11 (5), user_12 (4), user_13 (4).</w:t>
       </w:r>
     </w:p>
+    <w:p>
+      <w:pPr>
+        <w:spacing w:before="80" w:after="80"/>
+      </w:pPr>
+      <w:r>
+        <w:rPr>
+          <w:b/>
+          <w:sz w:val="19"/>
+        </w:rPr>
+        <w:t>Table 6. Synthetic interest-group membership</w:t>
+      </w:r>
+    </w:p>
+    <w:tbl>
+      <w:tblPr>
+        <w:tblStyle w:val="TableGrid"/>
+        <w:tblW w:type="dxa" w:w="9360"/>
+        <w:jc w:val="left"/>
+        <w:tblLayout w:type="fixed"/>
+        <w:tblLook w:firstColumn="1" w:firstRow="1" w:lastColumn="0" w:lastRow="0" w:noHBand="0" w:noVBand="1" w:val="04A0"/>
+        <w:tblInd w:w="120" w:type="dxa"/>
+        <w:tblCellMar>
+          <w:top w:w="80" w:type="dxa"/>
+          <w:bottom w:w="80" w:type="dxa"/>
+          <w:start w:w="120" w:type="dxa"/>
+          <w:end w:w="120" w:type="dxa"/>
+        </w:tblCellMar>
+      </w:tblPr>
+      <w:tblGrid>
+        <w:gridCol w:w="6912"/>
+        <w:gridCol w:w="2448"/>
+      </w:tblGrid>
+      <w:tr>
+        <w:trPr>
+          <w:tblHeader w:val="true"/>
+        </w:trPr>
+        <w:tc>
+          <w:tcPr>
+            <w:tcW w:type="dxa" w:w="6912"/>
+            <w:shd w:fill="E9EEF3"/>
+            <w:vAlign w:val="center"/>
+          </w:tcPr>
+          <w:p>
+            <w:r>
+              <w:rPr>
+                <w:b/>
+                <w:sz w:val="17"/>
+              </w:rPr>
+              <w:t>Interest group</w:t>
+            </w:r>
+          </w:p>
+        </w:tc>
+        <w:tc>
+          <w:tcPr>
+            <w:tcW w:type="dxa" w:w="2448"/>
+            <w:shd w:fill="E9EEF3"/>
+            <w:vAlign w:val="center"/>
+          </w:tcPr>
+          <w:p>
+            <w:r>
+              <w:rPr>
+                <w:b/>
+                <w:sz w:val="17"/>
+              </w:rPr>
+              <w:t>Users</w:t>
+            </w:r>
+          </w:p>
+        </w:tc>
+      </w:tr>
+      <w:tr>
+        <w:tc>
+          <w:tcPr>
+            <w:tcW w:type="dxa" w:w="6912"/>
+            <w:vAlign w:val="center"/>
+          </w:tcPr>
+          <w:p>
+            <w:pPr>
+              <w:spacing w:after="0"/>
+            </w:pPr>
+            <w:r>
+              <w:rPr>
+                <w:sz w:val="16"/>
+              </w:rPr>
+              <w:t>Music</w:t>
+            </w:r>
+          </w:p>
+        </w:tc>
+        <w:tc>
+          <w:tcPr>
+            <w:tcW w:type="dxa" w:w="2448"/>
+            <w:vAlign w:val="center"/>
+          </w:tcPr>
+          <w:p>
+            <w:pPr>
+              <w:spacing w:after="0"/>
+            </w:pPr>
+            <w:r>
+              <w:rPr>
+                <w:sz w:val="16"/>
+              </w:rPr>
+              <w:t>2</w:t>
+            </w:r>
+          </w:p>
+        </w:tc>
+      </w:tr>
+      <w:tr>
+        <w:tc>
+          <w:tcPr>
+            <w:tcW w:type="dxa" w:w="6912"/>
+            <w:vAlign w:val="center"/>
+          </w:tcPr>
+          <w:p>
+            <w:pPr>
+              <w:spacing w:after="0"/>
+            </w:pPr>
+            <w:r>
+              <w:rPr>
+                <w:sz w:val="16"/>
+              </w:rPr>
+              <w:t>Sports</w:t>
+            </w:r>
+          </w:p>
+        </w:tc>
+        <w:tc>
+          <w:tcPr>
+            <w:tcW w:type="dxa" w:w="2448"/>
+            <w:vAlign w:val="center"/>
+          </w:tcPr>
+          <w:p>
+            <w:pPr>
+              <w:spacing w:after="0"/>
+            </w:pPr>
+            <w:r>
+              <w:rPr>
+                <w:sz w:val="16"/>
+              </w:rPr>
+              <w:t>8</w:t>
+            </w:r>
+          </w:p>
+        </w:tc>
+      </w:tr>
+      <w:tr>
+        <w:tc>
+          <w:tcPr>
+            <w:tcW w:type="dxa" w:w="6912"/>
+            <w:vAlign w:val="center"/>
+          </w:tcPr>
+          <w:p>
+            <w:pPr>
+              <w:spacing w:after="0"/>
+            </w:pPr>
+            <w:r>
+              <w:rPr>
+                <w:sz w:val="16"/>
+              </w:rPr>
+              <w:t>Tech</w:t>
+            </w:r>
+          </w:p>
+        </w:tc>
+        <w:tc>
+          <w:tcPr>
+            <w:tcW w:type="dxa" w:w="2448"/>
+            <w:vAlign w:val="center"/>
+          </w:tcPr>
+          <w:p>
+            <w:pPr>
+              <w:spacing w:after="0"/>
+            </w:pPr>
+            <w:r>
+              <w:rPr>
+                <w:sz w:val="16"/>
+              </w:rPr>
+              <w:t>7</w:t>
+            </w:r>
+          </w:p>
+        </w:tc>
+      </w:tr>
+      <w:tr>
+        <w:tc>
+          <w:tcPr>
+            <w:tcW w:type="dxa" w:w="6912"/>
+            <w:vAlign w:val="center"/>
+          </w:tcPr>
+          <w:p>
+            <w:pPr>
+              <w:spacing w:after="0"/>
+            </w:pPr>
+            <w:r>
+              <w:rPr>
+                <w:sz w:val="16"/>
+              </w:rPr>
+              <w:t>Travel</w:t>
+            </w:r>
+          </w:p>
+        </w:tc>
+        <w:tc>
+          <w:tcPr>
+            <w:tcW w:type="dxa" w:w="2448"/>
+            <w:vAlign w:val="center"/>
+          </w:tcPr>
+          <w:p>
+            <w:pPr>
+              <w:spacing w:after="0"/>
+            </w:pPr>
+            <w:r>
+              <w:rPr>
+                <w:sz w:val="16"/>
+              </w:rPr>
+              <w:t>3</w:t>
+            </w:r>
+          </w:p>
+        </w:tc>
+      </w:tr>
+    </w:tbl>
+    <w:p>
+      <w:pPr>
+        <w:pStyle w:val="Heading2"/>
+      </w:pPr>
+      <w:r>
+        <w:t>12.2 Initial categorical-color state</w:t>
+      </w:r>
+    </w:p>
+    <w:p>
+      <w:pPr>
+        <w:widowControl/>
+      </w:pPr>
+      <w:r>
+        <w:t>Categorical color was used to support comparison of synthetic interest groups. Node coordinates, edges, labels, and hover fields were fixed.</w:t>
+      </w:r>
+    </w:p>
+    <w:p>
+      <w:pPr>
+        <w:jc w:val="center"/>
+      </w:pPr>
+      <w:r>
+        <w:drawing>
+          <wp:inline xmlns:a="http://schemas.openxmlformats.org/drawingml/2006/main" xmlns:pic="http://schemas.openxmlformats.org/drawingml/2006/picture">
+            <wp:extent cx="5623560" cy="3163252"/>
+            <wp:docPr id="8" name="Picture 8" descr="Network dashboard in the categorical interest-group color mode."/>
+            <wp:cNvGraphicFramePr>
+              <a:graphicFrameLocks noChangeAspect="1"/>
+            </wp:cNvGraphicFramePr>
+            <a:graphic>
+              <a:graphicData uri="http://schemas.openxmlformats.org/drawingml/2006/picture">
+                <pic:pic>
+                  <pic:nvPicPr>
+                    <pic:cNvPr id="0" name="network-toggle-before.png"/>
+                    <pic:cNvPicPr/>
+                  </pic:nvPicPr>
+                  <pic:blipFill>
+                    <a:blip r:embed="rId18"/>
+                    <a:stretch>
+                      <a:fillRect/>
+                    </a:stretch>
+                  </pic:blipFill>
+                  <pic:spPr>
+                    <a:xfrm>
+                      <a:off x="0" y="0"/>
+                      <a:ext cx="5623560" cy="3163252"/>
+                    </a:xfrm>
+                    <a:prstGeom prst="rect"/>
+                  </pic:spPr>
+                </pic:pic>
+              </a:graphicData>
+            </a:graphic>
+          </wp:inline>
+        </w:drawing>
+      </w:r>
+    </w:p>
+    <w:p>
+      <w:pPr>
+        <w:pStyle w:val="Caption"/>
+        <w:keepNext w:val="0"/>
+        <w:jc w:val="center"/>
+      </w:pPr>
+      <w:r>
+        <w:rPr>
+          <w:i/>
+          <w:sz w:val="18"/>
+        </w:rPr>
+        <w:t>Figure 8. Interactive network colored by interest group.</w:t>
+      </w:r>
+    </w:p>
+    <w:p>
+      <w:pPr>
+        <w:pStyle w:val="Heading2"/>
+      </w:pPr>
+      <w:r>
+        <w:t>12.3 Continuous in-degree state</w:t>
+      </w:r>
+    </w:p>
+    <w:p>
+      <w:pPr>
+        <w:widowControl/>
+      </w:pPr>
+      <w:r>
+        <w:t>The dropdown changed marker color, legend, and scale metadata to in-degree while coordinates remained fixed. Position preservation was verified as True.</w:t>
+      </w:r>
+    </w:p>
+    <w:p>
+      <w:pPr>
+        <w:jc w:val="center"/>
+      </w:pPr>
+      <w:r>
+        <w:drawing>
+          <wp:inline xmlns:a="http://schemas.openxmlformats.org/drawingml/2006/main" xmlns:pic="http://schemas.openxmlformats.org/drawingml/2006/picture">
+            <wp:extent cx="5623560" cy="3163252"/>
+            <wp:docPr id="9" name="Picture 9" descr="Network dashboard in the continuous in-degree color mode."/>
+            <wp:cNvGraphicFramePr>
+              <a:graphicFrameLocks noChangeAspect="1"/>
+            </wp:cNvGraphicFramePr>
+            <a:graphic>
+              <a:graphicData uri="http://schemas.openxmlformats.org/drawingml/2006/picture">
+                <pic:pic>
+                  <pic:nvPicPr>
+                    <pic:cNvPr id="0" name="network-toggle-in-degree.png"/>
+                    <pic:cNvPicPr/>
+                  </pic:nvPicPr>
+                  <pic:blipFill>
+                    <a:blip r:embed="rId19"/>
+                    <a:stretch>
+                      <a:fillRect/>
+                    </a:stretch>
+                  </pic:blipFill>
+                  <pic:spPr>
+                    <a:xfrm>
+                      <a:off x="0" y="0"/>
+                      <a:ext cx="5623560" cy="3163252"/>
+                    </a:xfrm>
+                    <a:prstGeom prst="rect"/>
+                  </pic:spPr>
+                </pic:pic>
+              </a:graphicData>
+            </a:graphic>
+          </wp:inline>
+        </w:drawing>
+      </w:r>
+    </w:p>
+    <w:p>
+      <w:pPr>
+        <w:pStyle w:val="Caption"/>
+        <w:keepNext w:val="0"/>
+        <w:jc w:val="center"/>
+      </w:pPr>
+      <w:r>
+        <w:rPr>
+          <w:i/>
+          <w:sz w:val="18"/>
+        </w:rPr>
+        <w:t>Figure 9. Interactive network colored by in-degree.</w:t>
+      </w:r>
+    </w:p>
+    <w:p>
+      <w:pPr>
+        <w:pStyle w:val="Heading2"/>
+      </w:pPr>
+      <w:r>
+        <w:t>12.4 Interpretation, limitations, and verification</w:t>
+      </w:r>
+    </w:p>
+    <w:p>
+      <w:pPr>
+        <w:widowControl/>
+      </w:pPr>
+      <w:r>
+        <w:t>The categorical state supported group-mixing interpretation, while the continuous state emphasized incoming-tie popularity. Perceptual change was attributable to color because position was preserved.</w:t>
+      </w:r>
+    </w:p>
+    <w:p>
+      <w:pPr>
+        <w:widowControl/>
+      </w:pPr>
+      <w:r>
+        <w:t>The graph is synthetic, and Plotly line traces do not display arrowheads. Direction remains available through degree metrics. Both dropdown states were verified through browser interaction.</w:t>
+      </w:r>
+    </w:p>
+    <w:p>
+      <w:pPr>
+        <w:pStyle w:val="Heading1"/>
+      </w:pPr>
+      <w:r>
+        <w:t>13. Exercise 7 - Research-domain knowledge graph</w:t>
+      </w:r>
+    </w:p>
+    <w:p>
+      <w:pPr>
+        <w:widowControl/>
+      </w:pPr>
+      <w:r>
+        <w:t>A typed synthetic graph was used to represent research areas, methods, tools, applications, outcomes, and semantic relationships.</w:t>
+      </w:r>
+    </w:p>
+    <w:p>
+      <w:pPr>
+        <w:pStyle w:val="Heading2"/>
+      </w:pPr>
+      <w:r>
+        <w:t>13.1 Construction and metric procedure</w:t>
+      </w:r>
+    </w:p>
+    <w:p>
+      <w:pPr>
+        <w:widowControl/>
+      </w:pPr>
+      <w:r>
+        <w:t>The graph contains 15 nodes and 21 undirected links. Density was 0.2000, average degree was 2.80, and connectivity was verified as True.</w:t>
+      </w:r>
+    </w:p>
+    <w:p>
+      <w:pPr>
+        <w:widowControl/>
+      </w:pPr>
+      <w:r>
+        <w:t>Degree centrality, inverse-strength weighted betweenness, closeness, and strength-weighted PageRank were calculated. Edge distance was defined as 1 / strength before shortest-path betweenness was evaluated.</w:t>
+      </w:r>
+    </w:p>
+    <w:p>
+      <w:pPr>
+        <w:pStyle w:val="Heading2"/>
+      </w:pPr>
+      <w:r>
+        <w:t>13.2 Verified centrality results</w:t>
+      </w:r>
+    </w:p>
+    <w:p>
+      <w:pPr>
+        <w:widowControl/>
+      </w:pPr>
+      <w:r>
+        <w:t>Recommendation Systems received the largest weighted betweenness value (0.5385).</w:t>
+      </w:r>
+    </w:p>
+    <w:p>
+      <w:pPr>
+        <w:spacing w:before="80" w:after="80"/>
+      </w:pPr>
+      <w:r>
+        <w:rPr>
+          <w:b/>
+          <w:sz w:val="19"/>
+        </w:rPr>
+        <w:t>Table 7. Five highest weighted-betweenness nodes</w:t>
+      </w:r>
+    </w:p>
+    <w:tbl>
+      <w:tblPr>
+        <w:tblStyle w:val="TableGrid"/>
+        <w:tblW w:type="dxa" w:w="9360"/>
+        <w:jc w:val="left"/>
+        <w:tblLayout w:type="fixed"/>
+        <w:tblLook w:firstColumn="1" w:firstRow="1" w:lastColumn="0" w:lastRow="0" w:noHBand="0" w:noVBand="1" w:val="04A0"/>
+        <w:tblInd w:w="120" w:type="dxa"/>
+        <w:tblCellMar>
+          <w:top w:w="80" w:type="dxa"/>
+          <w:bottom w:w="80" w:type="dxa"/>
+          <w:start w:w="120" w:type="dxa"/>
+          <w:end w:w="120" w:type="dxa"/>
+        </w:tblCellMar>
+      </w:tblPr>
+      <w:tblGrid>
+        <w:gridCol w:w="2088"/>
+        <w:gridCol w:w="1800"/>
+        <w:gridCol w:w="864"/>
+        <w:gridCol w:w="1512"/>
+        <w:gridCol w:w="1512"/>
+        <w:gridCol w:w="1584"/>
+      </w:tblGrid>
+      <w:tr>
+        <w:trPr>
+          <w:tblHeader w:val="true"/>
+        </w:trPr>
+        <w:tc>
+          <w:tcPr>
+            <w:tcW w:type="dxa" w:w="2088"/>
+            <w:shd w:fill="E9EEF3"/>
+            <w:vAlign w:val="center"/>
+          </w:tcPr>
+          <w:p>
+            <w:r>
+              <w:rPr>
+                <w:b/>
+                <w:sz w:val="17"/>
+              </w:rPr>
+              <w:t>Node</w:t>
+            </w:r>
+          </w:p>
+        </w:tc>
+        <w:tc>
+          <w:tcPr>
+            <w:tcW w:type="dxa" w:w="1800"/>
+            <w:shd w:fill="E9EEF3"/>
+            <w:vAlign w:val="center"/>
+          </w:tcPr>
+          <w:p>
+            <w:r>
+              <w:rPr>
+                <w:b/>
+                <w:sz w:val="17"/>
+              </w:rPr>
+              <w:t>Type</w:t>
+            </w:r>
+          </w:p>
+        </w:tc>
+        <w:tc>
+          <w:tcPr>
+            <w:tcW w:type="dxa" w:w="864"/>
+            <w:shd w:fill="E9EEF3"/>
+            <w:vAlign w:val="center"/>
+          </w:tcPr>
+          <w:p>
+            <w:r>
+              <w:rPr>
+                <w:b/>
+                <w:sz w:val="17"/>
+              </w:rPr>
+              <w:t>Degree</w:t>
+            </w:r>
+          </w:p>
+        </w:tc>
+        <w:tc>
+          <w:tcPr>
+            <w:tcW w:type="dxa" w:w="1512"/>
+            <w:shd w:fill="E9EEF3"/>
+            <w:vAlign w:val="center"/>
+          </w:tcPr>
+          <w:p>
+            <w:r>
+              <w:rPr>
+                <w:b/>
+                <w:sz w:val="17"/>
+              </w:rPr>
+              <w:t>Betweenness</w:t>
+            </w:r>
+          </w:p>
+        </w:tc>
+        <w:tc>
+          <w:tcPr>
+            <w:tcW w:type="dxa" w:w="1512"/>
+            <w:shd w:fill="E9EEF3"/>
+            <w:vAlign w:val="center"/>
+          </w:tcPr>
+          <w:p>
+            <w:r>
+              <w:rPr>
+                <w:b/>
+                <w:sz w:val="17"/>
+              </w:rPr>
+              <w:t>Closeness</w:t>
+            </w:r>
+          </w:p>
+        </w:tc>
+        <w:tc>
+          <w:tcPr>
+            <w:tcW w:type="dxa" w:w="1584"/>
+            <w:shd w:fill="E9EEF3"/>
+            <w:vAlign w:val="center"/>
+          </w:tcPr>
+          <w:p>
+            <w:r>
+              <w:rPr>
+                <w:b/>
+                <w:sz w:val="17"/>
+              </w:rPr>
+              <w:t>PageRank</w:t>
+            </w:r>
+          </w:p>
+        </w:tc>
+      </w:tr>
+      <w:tr>
+        <w:tc>
+          <w:tcPr>
+            <w:tcW w:type="dxa" w:w="2088"/>
+            <w:vAlign w:val="center"/>
+          </w:tcPr>
+          <w:p>
+            <w:pPr>
+              <w:spacing w:after="0"/>
+            </w:pPr>
+            <w:r>
+              <w:rPr>
+                <w:sz w:val="16"/>
+              </w:rPr>
+              <w:t>Recommendation Systems</w:t>
+            </w:r>
+          </w:p>
+        </w:tc>
+        <w:tc>
+          <w:tcPr>
+            <w:tcW w:type="dxa" w:w="1800"/>
+            <w:vAlign w:val="center"/>
+          </w:tcPr>
+          <w:p>
+            <w:pPr>
+              <w:spacing w:after="0"/>
+            </w:pPr>
+            <w:r>
+              <w:rPr>
+                <w:sz w:val="16"/>
+              </w:rPr>
+              <w:t>Research area</w:t>
+            </w:r>
+          </w:p>
+        </w:tc>
+        <w:tc>
+          <w:tcPr>
+            <w:tcW w:type="dxa" w:w="864"/>
+            <w:vAlign w:val="center"/>
+          </w:tcPr>
+          <w:p>
+            <w:pPr>
+              <w:spacing w:after="0"/>
+            </w:pPr>
+            <w:r>
+              <w:rPr>
+                <w:sz w:val="16"/>
+              </w:rPr>
+              <w:t>5</w:t>
+            </w:r>
+          </w:p>
+        </w:tc>
+        <w:tc>
+          <w:tcPr>
+            <w:tcW w:type="dxa" w:w="1512"/>
+            <w:vAlign w:val="center"/>
+          </w:tcPr>
+          <w:p>
+            <w:pPr>
+              <w:spacing w:after="0"/>
+            </w:pPr>
+            <w:r>
+              <w:rPr>
+                <w:sz w:val="16"/>
+              </w:rPr>
+              <w:t>0.5385</w:t>
+            </w:r>
+          </w:p>
+        </w:tc>
+        <w:tc>
+          <w:tcPr>
+            <w:tcW w:type="dxa" w:w="1512"/>
+            <w:vAlign w:val="center"/>
+          </w:tcPr>
+          <w:p>
+            <w:pPr>
+              <w:spacing w:after="0"/>
+            </w:pPr>
+            <w:r>
+              <w:rPr>
+                <w:sz w:val="16"/>
+              </w:rPr>
+              <w:t>0.5600</w:t>
+            </w:r>
+          </w:p>
+        </w:tc>
+        <w:tc>
+          <w:tcPr>
+            <w:tcW w:type="dxa" w:w="1584"/>
+            <w:vAlign w:val="center"/>
+          </w:tcPr>
+          <w:p>
+            <w:pPr>
+              <w:spacing w:after="0"/>
+            </w:pPr>
+            <w:r>
+              <w:rPr>
+                <w:sz w:val="16"/>
+              </w:rPr>
+              <w:t>0.1297</w:t>
+            </w:r>
+          </w:p>
+        </w:tc>
+      </w:tr>
+      <w:tr>
+        <w:tc>
+          <w:tcPr>
+            <w:tcW w:type="dxa" w:w="2088"/>
+            <w:vAlign w:val="center"/>
+          </w:tcPr>
+          <w:p>
+            <w:pPr>
+              <w:spacing w:after="0"/>
+            </w:pPr>
+            <w:r>
+              <w:rPr>
+                <w:sz w:val="16"/>
+              </w:rPr>
+              <w:t>Artificial Intelligence</w:t>
+            </w:r>
+          </w:p>
+        </w:tc>
+        <w:tc>
+          <w:tcPr>
+            <w:tcW w:type="dxa" w:w="1800"/>
+            <w:vAlign w:val="center"/>
+          </w:tcPr>
+          <w:p>
+            <w:pPr>
+              <w:spacing w:after="0"/>
+            </w:pPr>
+            <w:r>
+              <w:rPr>
+                <w:sz w:val="16"/>
+              </w:rPr>
+              <w:t>Research area</w:t>
+            </w:r>
+          </w:p>
+        </w:tc>
+        <w:tc>
+          <w:tcPr>
+            <w:tcW w:type="dxa" w:w="864"/>
+            <w:vAlign w:val="center"/>
+          </w:tcPr>
+          <w:p>
+            <w:pPr>
+              <w:spacing w:after="0"/>
+            </w:pPr>
+            <w:r>
+              <w:rPr>
+                <w:sz w:val="16"/>
+              </w:rPr>
+              <w:t>3</w:t>
+            </w:r>
+          </w:p>
+        </w:tc>
+        <w:tc>
+          <w:tcPr>
+            <w:tcW w:type="dxa" w:w="1512"/>
+            <w:vAlign w:val="center"/>
+          </w:tcPr>
+          <w:p>
+            <w:pPr>
+              <w:spacing w:after="0"/>
+            </w:pPr>
+            <w:r>
+              <w:rPr>
+                <w:sz w:val="16"/>
+              </w:rPr>
+              <w:t>0.2509</w:t>
+            </w:r>
+          </w:p>
+        </w:tc>
+        <w:tc>
+          <w:tcPr>
+            <w:tcW w:type="dxa" w:w="1512"/>
+            <w:vAlign w:val="center"/>
+          </w:tcPr>
+          <w:p>
+            <w:pPr>
+              <w:spacing w:after="0"/>
+            </w:pPr>
+            <w:r>
+              <w:rPr>
+                <w:sz w:val="16"/>
+              </w:rPr>
+              <w:t>0.4667</w:t>
+            </w:r>
+          </w:p>
+        </w:tc>
+        <w:tc>
+          <w:tcPr>
+            <w:tcW w:type="dxa" w:w="1584"/>
+            <w:vAlign w:val="center"/>
+          </w:tcPr>
+          <w:p>
+            <w:pPr>
+              <w:spacing w:after="0"/>
+            </w:pPr>
+            <w:r>
+              <w:rPr>
+                <w:sz w:val="16"/>
+              </w:rPr>
+              <w:t>0.0790</w:t>
+            </w:r>
+          </w:p>
+        </w:tc>
+      </w:tr>
+      <w:tr>
+        <w:tc>
+          <w:tcPr>
+            <w:tcW w:type="dxa" w:w="2088"/>
+            <w:vAlign w:val="center"/>
+          </w:tcPr>
+          <w:p>
+            <w:pPr>
+              <w:spacing w:after="0"/>
+            </w:pPr>
+            <w:r>
+              <w:rPr>
+                <w:sz w:val="16"/>
+              </w:rPr>
+              <w:t>Deep Learning</w:t>
+            </w:r>
+          </w:p>
+        </w:tc>
+        <w:tc>
+          <w:tcPr>
+            <w:tcW w:type="dxa" w:w="1800"/>
+            <w:vAlign w:val="center"/>
+          </w:tcPr>
+          <w:p>
+            <w:pPr>
+              <w:spacing w:after="0"/>
+            </w:pPr>
+            <w:r>
+              <w:rPr>
+                <w:sz w:val="16"/>
+              </w:rPr>
+              <w:t>Method</w:t>
+            </w:r>
+          </w:p>
+        </w:tc>
+        <w:tc>
+          <w:tcPr>
+            <w:tcW w:type="dxa" w:w="864"/>
+            <w:vAlign w:val="center"/>
+          </w:tcPr>
+          <w:p>
+            <w:pPr>
+              <w:spacing w:after="0"/>
+            </w:pPr>
+            <w:r>
+              <w:rPr>
+                <w:sz w:val="16"/>
+              </w:rPr>
+              <w:t>4</w:t>
+            </w:r>
+          </w:p>
+        </w:tc>
+        <w:tc>
+          <w:tcPr>
+            <w:tcW w:type="dxa" w:w="1512"/>
+            <w:vAlign w:val="center"/>
+          </w:tcPr>
+          <w:p>
+            <w:pPr>
+              <w:spacing w:after="0"/>
+            </w:pPr>
+            <w:r>
+              <w:rPr>
+                <w:sz w:val="16"/>
+              </w:rPr>
+              <w:t>0.1923</w:t>
+            </w:r>
+          </w:p>
+        </w:tc>
+        <w:tc>
+          <w:tcPr>
+            <w:tcW w:type="dxa" w:w="1512"/>
+            <w:vAlign w:val="center"/>
+          </w:tcPr>
+          <w:p>
+            <w:pPr>
+              <w:spacing w:after="0"/>
+            </w:pPr>
+            <w:r>
+              <w:rPr>
+                <w:sz w:val="16"/>
+              </w:rPr>
+              <w:t>0.4667</w:t>
+            </w:r>
+          </w:p>
+        </w:tc>
+        <w:tc>
+          <w:tcPr>
+            <w:tcW w:type="dxa" w:w="1584"/>
+            <w:vAlign w:val="center"/>
+          </w:tcPr>
+          <w:p>
+            <w:pPr>
+              <w:spacing w:after="0"/>
+            </w:pPr>
+            <w:r>
+              <w:rPr>
+                <w:sz w:val="16"/>
+              </w:rPr>
+              <w:t>0.1011</w:t>
+            </w:r>
+          </w:p>
+        </w:tc>
+      </w:tr>
+      <w:tr>
+        <w:tc>
+          <w:tcPr>
+            <w:tcW w:type="dxa" w:w="2088"/>
+            <w:vAlign w:val="center"/>
+          </w:tcPr>
+          <w:p>
+            <w:pPr>
+              <w:spacing w:after="0"/>
+            </w:pPr>
+            <w:r>
+              <w:rPr>
+                <w:sz w:val="16"/>
+              </w:rPr>
+              <w:t>Computer Vision</w:t>
+            </w:r>
+          </w:p>
+        </w:tc>
+        <w:tc>
+          <w:tcPr>
+            <w:tcW w:type="dxa" w:w="1800"/>
+            <w:vAlign w:val="center"/>
+          </w:tcPr>
+          <w:p>
+            <w:pPr>
+              <w:spacing w:after="0"/>
+            </w:pPr>
+            <w:r>
+              <w:rPr>
+                <w:sz w:val="16"/>
+              </w:rPr>
+              <w:t>Research area</w:t>
+            </w:r>
+          </w:p>
+        </w:tc>
+        <w:tc>
+          <w:tcPr>
+            <w:tcW w:type="dxa" w:w="864"/>
+            <w:vAlign w:val="center"/>
+          </w:tcPr>
+          <w:p>
+            <w:pPr>
+              <w:spacing w:after="0"/>
+            </w:pPr>
+            <w:r>
+              <w:rPr>
+                <w:sz w:val="16"/>
+              </w:rPr>
+              <w:t>3</w:t>
+            </w:r>
+          </w:p>
+        </w:tc>
+        <w:tc>
+          <w:tcPr>
+            <w:tcW w:type="dxa" w:w="1512"/>
+            <w:vAlign w:val="center"/>
+          </w:tcPr>
+          <w:p>
+            <w:pPr>
+              <w:spacing w:after="0"/>
+            </w:pPr>
+            <w:r>
+              <w:rPr>
+                <w:sz w:val="16"/>
+              </w:rPr>
+              <w:t>0.1667</w:t>
+            </w:r>
+          </w:p>
+        </w:tc>
+        <w:tc>
+          <w:tcPr>
+            <w:tcW w:type="dxa" w:w="1512"/>
+            <w:vAlign w:val="center"/>
+          </w:tcPr>
+          <w:p>
+            <w:pPr>
+              <w:spacing w:after="0"/>
+            </w:pPr>
+            <w:r>
+              <w:rPr>
+                <w:sz w:val="16"/>
+              </w:rPr>
+              <w:t>0.4375</w:t>
+            </w:r>
+          </w:p>
+        </w:tc>
+        <w:tc>
+          <w:tcPr>
+            <w:tcW w:type="dxa" w:w="1584"/>
+            <w:vAlign w:val="center"/>
+          </w:tcPr>
+          <w:p>
+            <w:pPr>
+              <w:spacing w:after="0"/>
+            </w:pPr>
+            <w:r>
+              <w:rPr>
+                <w:sz w:val="16"/>
+              </w:rPr>
+              <w:t>0.0795</w:t>
+            </w:r>
+          </w:p>
+        </w:tc>
+      </w:tr>
+      <w:tr>
+        <w:tc>
+          <w:tcPr>
+            <w:tcW w:type="dxa" w:w="2088"/>
+            <w:vAlign w:val="center"/>
+          </w:tcPr>
+          <w:p>
+            <w:pPr>
+              <w:spacing w:after="0"/>
+            </w:pPr>
+            <w:r>
+              <w:rPr>
+                <w:sz w:val="16"/>
+              </w:rPr>
+              <w:t>Graph Neural Networks</w:t>
+            </w:r>
+          </w:p>
+        </w:tc>
+        <w:tc>
+          <w:tcPr>
+            <w:tcW w:type="dxa" w:w="1800"/>
+            <w:vAlign w:val="center"/>
+          </w:tcPr>
+          <w:p>
+            <w:pPr>
+              <w:spacing w:after="0"/>
+            </w:pPr>
+            <w:r>
+              <w:rPr>
+                <w:sz w:val="16"/>
+              </w:rPr>
+              <w:t>Method</w:t>
+            </w:r>
+          </w:p>
+        </w:tc>
+        <w:tc>
+          <w:tcPr>
+            <w:tcW w:type="dxa" w:w="864"/>
+            <w:vAlign w:val="center"/>
+          </w:tcPr>
+          <w:p>
+            <w:pPr>
+              <w:spacing w:after="0"/>
+            </w:pPr>
+            <w:r>
+              <w:rPr>
+                <w:sz w:val="16"/>
+              </w:rPr>
+              <w:t>3</w:t>
+            </w:r>
+          </w:p>
+        </w:tc>
+        <w:tc>
+          <w:tcPr>
+            <w:tcW w:type="dxa" w:w="1512"/>
+            <w:vAlign w:val="center"/>
+          </w:tcPr>
+          <w:p>
+            <w:pPr>
+              <w:spacing w:after="0"/>
+            </w:pPr>
+            <w:r>
+              <w:rPr>
+                <w:sz w:val="16"/>
+              </w:rPr>
+              <w:t>0.1612</w:t>
+            </w:r>
+          </w:p>
+        </w:tc>
+        <w:tc>
+          <w:tcPr>
+            <w:tcW w:type="dxa" w:w="1512"/>
+            <w:vAlign w:val="center"/>
+          </w:tcPr>
+          <w:p>
+            <w:pPr>
+              <w:spacing w:after="0"/>
+            </w:pPr>
+            <w:r>
+              <w:rPr>
+                <w:sz w:val="16"/>
+              </w:rPr>
+              <w:t>0.5000</w:t>
+            </w:r>
+          </w:p>
+        </w:tc>
+        <w:tc>
+          <w:tcPr>
+            <w:tcW w:type="dxa" w:w="1584"/>
+            <w:vAlign w:val="center"/>
+          </w:tcPr>
+          <w:p>
+            <w:pPr>
+              <w:spacing w:after="0"/>
+            </w:pPr>
+            <w:r>
+              <w:rPr>
+                <w:sz w:val="16"/>
+              </w:rPr>
+              <w:t>0.0630</w:t>
+            </w:r>
+          </w:p>
+        </w:tc>
+      </w:tr>
+    </w:tbl>
     <w:p>
       <w:pPr>
         <w:jc w:val="center"/>
@@ -2031,7 +5480,7 @@
         <w:drawing>
           <wp:inline xmlns:a="http://schemas.openxmlformats.org/drawingml/2006/main" xmlns:pic="http://schemas.openxmlformats.org/drawingml/2006/picture">
             <wp:extent cx="5623560" cy="4344940"/>
-            <wp:docPr id="7" name="Picture 7" descr="Typed research knowledge graph with weighted semantic relationships."/>
+            <wp:docPr id="10" name="Picture 10" descr="Typed knowledge graph with weighted semantic relationships."/>
             <wp:cNvGraphicFramePr>
               <a:graphicFrameLocks noChangeAspect="1"/>
             </wp:cNvGraphicFramePr>
@@ -2043,7 +5492,7 @@
                     <pic:cNvPicPr/>
                   </pic:nvPicPr>
                   <pic:blipFill>
-                    <a:blip r:embed="rId17"/>
+                    <a:blip r:embed="rId20"/>
                     <a:stretch>
                       <a:fillRect/>
                     </a:stretch>
@@ -2073,7 +5522,39 @@
           <w:i/>
           <w:sz w:val="18"/>
         </w:rPr>
-        <w:t>Figure 7. Synthetic applied-AI and multimedia research knowledge graph.</w:t>
+        <w:t>Figure 10. Synthetic Applied AI and Multimedia knowledge graph.</w:t>
+      </w:r>
+    </w:p>
+    <w:p>
+      <w:pPr>
+        <w:pStyle w:val="Heading2"/>
+      </w:pPr>
+      <w:r>
+        <w:t>13.3 Interpretation, limitations, and verification</w:t>
+      </w:r>
+    </w:p>
+    <w:p>
+      <w:pPr>
+        <w:widowControl/>
+      </w:pPr>
+      <w:r>
+        <w:t>Recommendation Systems is the strongest bridge by inverse-strength weighted betweenness, linking research themes, technical methods, and application outcomes. The graph is synthetic and demonstrates structural interpretation, not empirical evidence about a real research community.</w:t>
+      </w:r>
+    </w:p>
+    <w:p>
+      <w:pPr>
+        <w:widowControl/>
+      </w:pPr>
+      <w:r>
+        <w:t>The graph was not extracted from publications. The inverse-strength transformation assumes that stronger semantic relationships represent shorter effective distances. A different substantive meaning for strength would require a different transformation.</w:t>
+      </w:r>
+    </w:p>
+    <w:p>
+      <w:pPr>
+        <w:widowControl/>
+      </w:pPr>
+      <w:r>
+        <w:t>Stored node and edge tables, calculated centrality metrics, and static and interactive figures provide reproduction evidence.</w:t>
       </w:r>
     </w:p>
     <w:p>
@@ -2137,7 +5618,7 @@
         <w:widowControl/>
       </w:pPr>
       <w:r>
-        <w:t>Video posts have the largest observed mean engagement, Kamada-Kawai most clearly presents the supplied small-world graph, weighted encoding separates tie salience from centrality, and the model comparison shows that social-network realism is multidimensional.</w:t>
+        <w:t>The largest observed mean engagement was associated with video posts. The supplied small-world graph was presented most clearly by Kamada-Kawai, tie salience was separated from centrality through weighted encoding, and the multidimensional nature of social-network realism was revealed by the model comparison.</w:t>
       </w:r>
     </w:p>
     <w:p>
@@ -2145,7 +5626,7 @@
         <w:widowControl/>
       </w:pPr>
       <w:r>
-        <w:t>Future work should add ethically collected reach denominators, multiple seller populations, repeated graph simulations, uncertainty intervals, content representations, and user testing of dashboard accessibility.</w:t>
+        <w:t>For future work, ethically collected reach denominators, multiple seller populations, repeated graph simulations, uncertainty intervals, content representations, and user testing of dashboard accessibility should be added.</w:t>
       </w:r>
     </w:p>
     <w:p>
@@ -2162,43 +5643,67 @@
       </w:r>
     </w:p>
     <w:p>
+      <w:pPr>
+        <w:pStyle w:val="ListNumber"/>
+      </w:pPr>
       <w:r>
-        <w:t>1. Dehouche, N. (2018). Facebook Live Sellers in Thailand [Dataset]. UCI Machine Learning Repository. https://doi.org/10.24432/C5R60S</w:t>
+        <w:t>Dehouche, N. (2018). Facebook Live Sellers in Thailand [Dataset]. UCI Machine Learning Repository. https://doi.org/10.24432/C5R60S</w:t>
       </w:r>
     </w:p>
     <w:p>
+      <w:pPr>
+        <w:pStyle w:val="ListNumber"/>
+      </w:pPr>
       <w:r>
-        <w:t>2. Dehouche, N. (2020). Dataset on usage and engagement patterns for Facebook Live sellers in Thailand. Data in Brief, 30, 105661. https://doi.org/10.1016/j.dib.2020.105661</w:t>
+        <w:t>Dehouche, N. (2020). Dataset on usage and engagement patterns for Facebook Live sellers in Thailand. Data in Brief, 30, 105661. https://doi.org/10.1016/j.dib.2020.105661</w:t>
       </w:r>
     </w:p>
     <w:p>
+      <w:pPr>
+        <w:pStyle w:val="ListNumber"/>
+      </w:pPr>
       <w:r>
-        <w:t>3. Hagberg, A. A., Schult, D. A., &amp; Swart, P. J. (2008). Exploring network structure, dynamics, and function using NetworkX. Proceedings of SciPy 2008, 11-15.</w:t>
+        <w:t>Hagberg, A. A., Schult, D. A., &amp; Swart, P. J. (2008). Exploring network structure, dynamics, and function using NetworkX. Proceedings of SciPy 2008, 11-15.</w:t>
       </w:r>
     </w:p>
     <w:p>
+      <w:pPr>
+        <w:pStyle w:val="ListNumber"/>
+      </w:pPr>
       <w:r>
-        <w:t>4. Barabasi, A.-L. (2016). Network Science. Cambridge University Press. http://networksciencebook.com/</w:t>
+        <w:t>Barabasi, A.-L. (2016). Network Science. Cambridge University Press. http://networksciencebook.com/</w:t>
       </w:r>
     </w:p>
     <w:p>
+      <w:pPr>
+        <w:pStyle w:val="ListNumber"/>
+      </w:pPr>
       <w:r>
-        <w:t>5. Pandas documentation. https://pandas.pydata.org/docs/</w:t>
+        <w:t>Pandas documentation. https://pandas.pydata.org/docs/</w:t>
       </w:r>
     </w:p>
     <w:p>
+      <w:pPr>
+        <w:pStyle w:val="ListNumber"/>
+      </w:pPr>
       <w:r>
-        <w:t>6. Matplotlib documentation. https://matplotlib.org/stable/</w:t>
+        <w:t>Matplotlib documentation. https://matplotlib.org/stable/</w:t>
       </w:r>
     </w:p>
     <w:p>
+      <w:pPr>
+        <w:pStyle w:val="ListNumber"/>
+      </w:pPr>
       <w:r>
-        <w:t>7. Plotly Python documentation. https://plotly.com/python/</w:t>
+        <w:t>Plotly Python documentation. https://plotly.com/python/</w:t>
       </w:r>
     </w:p>
     <w:p>
+      <w:pPr>
+        <w:pStyle w:val="ListNumber"/>
+      </w:pPr>
       <w:r>
-        <w:t>8. NetworkX documentation. https://networkx.org/documentation/stable/</w:t>
+        <w:t>NetworkX documentation. https://networkx.org/documentation/stable/</w:t>
       </w:r>
     </w:p>
     <w:p>

</xml_diff>